<commit_message>
Add technical implementation details for AI AntiHijack deployment
Update proposal document to include a detailed technical implementation section explaining how the AI AntiHijack system will be deployed on Tragar's vehicles via API integration, driver smartphone app, or OBD-II devices.

Replit-Commit-Author: Agent
Replit-Commit-Session-Id: 0cbe7a84-a7a6-4a51-b09c-2be09cbda9ee
Replit-Commit-Checkpoint-Type: full_checkpoint
Replit-Commit-Event-Id: b8a3d05d-6489-4ba9-ae36-9601043435f9
Replit-Commit-Screenshot-Url: https://storage.googleapis.com/screenshot-production-us-central1/1f99a8d9-3543-48bc-8564-b0463564e29d/0cbe7a84-a7a6-4a51-b09c-2be09cbda9ee/UoPDWsL
</commit_message>
<xml_diff>
--- a/docs/AI_AntiHijack_Tragar_Pilot_Proposal.docx
+++ b/docs/AI_AntiHijack_Tragar_Pilot_Proposal.docx
@@ -1078,6 +1078,3267 @@
       </w:pPr>
       <w:r>
         <w:t xml:space="preserve"/>
+      </w:r>
+    </w:p>
+    <w:p>
+      <w:r>
+        <w:br w:type="page"/>
+      </w:r>
+    </w:p>
+    <w:p>
+      <w:pPr>
+        <w:pStyle w:val="Heading1"/>
+        <w:spacing w:after="200" w:before="400"/>
+      </w:pPr>
+      <w:r>
+        <w:rPr>
+          <w:rFonts w:ascii="Calibri" w:cs="Calibri" w:eastAsia="Calibri" w:hAnsi="Calibri"/>
+          <w:b/>
+          <w:bCs/>
+          <w:color w:val="1a1a2e"/>
+        </w:rPr>
+        <w:t xml:space="preserve">How It Will Be Implemented — The Technical Approach</w:t>
+      </w:r>
+    </w:p>
+    <w:p>
+      <w:pPr>
+        <w:spacing w:after="120"/>
+      </w:pPr>
+      <w:r>
+        <w:rPr>
+          <w:rFonts w:ascii="Calibri" w:cs="Calibri" w:eastAsia="Calibri" w:hAnsi="Calibri"/>
+          <w:color w:val="333333"/>
+          <w:sz w:val="22"/>
+          <w:szCs w:val="22"/>
+        </w:rPr>
+        <w:t xml:space="preserve">This section explains exactly how the AI AntiHijack system gets deployed on Tragar's vehicles. The key principle: we work WITH your existing infrastructure, not against it. No ripping out current systems, no expensive hardware, no downtime.</w:t>
+      </w:r>
+    </w:p>
+    <w:p>
+      <w:pPr>
+        <w:pStyle w:val="Heading2"/>
+        <w:spacing w:after="200" w:before="400"/>
+      </w:pPr>
+      <w:r>
+        <w:rPr>
+          <w:rFonts w:ascii="Calibri" w:cs="Calibri" w:eastAsia="Calibri" w:hAnsi="Calibri"/>
+          <w:b/>
+          <w:bCs/>
+          <w:color w:val="1a1a2e"/>
+        </w:rPr>
+        <w:t xml:space="preserve">Layer 1: Connecting to Your Existing Vehicle Data</w:t>
+      </w:r>
+    </w:p>
+    <w:p>
+      <w:pPr>
+        <w:spacing w:after="120"/>
+      </w:pPr>
+      <w:r>
+        <w:rPr>
+          <w:rFonts w:ascii="Calibri" w:cs="Calibri" w:eastAsia="Calibri" w:hAnsi="Calibri"/>
+          <w:color w:val="333333"/>
+          <w:sz w:val="22"/>
+          <w:szCs w:val="22"/>
+        </w:rPr>
+        <w:t xml:space="preserve">Every tracking system (Cartrack, Netstar, MiX, Ctrack, or any other provider Tragar uses) already collects GPS location, speed, ignition status, and stop/start events. The AI AntiHijack system connects to this data in one of three ways:</w:t>
+      </w:r>
+    </w:p>
+    <w:p>
+      <w:pPr>
+        <w:spacing w:after="100"/>
+      </w:pPr>
+      <w:r>
+        <w:rPr>
+          <w:rFonts w:ascii="Calibri" w:cs="Calibri" w:eastAsia="Calibri" w:hAnsi="Calibri"/>
+          <w:b/>
+          <w:bCs/>
+          <w:color w:val="1a1a2e"/>
+          <w:sz w:val="22"/>
+          <w:szCs w:val="22"/>
+        </w:rPr>
+        <w:t xml:space="preserve">Option A: API Integration (preferred — zero hardware)</w:t>
+      </w:r>
+    </w:p>
+    <w:p>
+      <w:pPr>
+        <w:spacing w:after="120"/>
+      </w:pPr>
+      <w:r>
+        <w:rPr>
+          <w:rFonts w:ascii="Calibri" w:cs="Calibri" w:eastAsia="Calibri" w:hAnsi="Calibri"/>
+          <w:color w:val="333333"/>
+          <w:sz w:val="22"/>
+          <w:szCs w:val="22"/>
+        </w:rPr>
+        <w:t xml:space="preserve">Most modern tracking providers offer an API — a data feed that allows authorised third-party systems to receive your vehicle data in real time. We connect to your tracking provider's API and receive the same GPS data your control room already sees.</w:t>
+      </w:r>
+    </w:p>
+    <w:p>
+      <w:pPr>
+        <w:pStyle w:val="ListParagraph"/>
+        <w:numPr>
+          <w:ilvl w:val="0"/>
+          <w:numId w:val="1"/>
+        </w:numPr>
+        <w:spacing w:after="80"/>
+      </w:pPr>
+      <w:r>
+        <w:rPr>
+          <w:rFonts w:ascii="Calibri" w:cs="Calibri" w:eastAsia="Calibri" w:hAnsi="Calibri"/>
+          <w:color w:val="333333"/>
+          <w:sz w:val="22"/>
+          <w:szCs w:val="22"/>
+        </w:rPr>
+        <w:t xml:space="preserve">No hardware installation required — purely a software connection</w:t>
+      </w:r>
+    </w:p>
+    <w:p>
+      <w:pPr>
+        <w:pStyle w:val="ListParagraph"/>
+        <w:numPr>
+          <w:ilvl w:val="0"/>
+          <w:numId w:val="1"/>
+        </w:numPr>
+        <w:spacing w:after="80"/>
+      </w:pPr>
+      <w:r>
+        <w:rPr>
+          <w:rFonts w:ascii="Calibri" w:cs="Calibri" w:eastAsia="Calibri" w:hAnsi="Calibri"/>
+          <w:color w:val="333333"/>
+          <w:sz w:val="22"/>
+          <w:szCs w:val="22"/>
+        </w:rPr>
+        <w:t xml:space="preserve">Takes 1–3 days to set up, depending on your tracking provider</w:t>
+      </w:r>
+    </w:p>
+    <w:p>
+      <w:pPr>
+        <w:pStyle w:val="ListParagraph"/>
+        <w:numPr>
+          <w:ilvl w:val="0"/>
+          <w:numId w:val="1"/>
+        </w:numPr>
+        <w:spacing w:after="80"/>
+      </w:pPr>
+      <w:r>
+        <w:rPr>
+          <w:rFonts w:ascii="Calibri" w:cs="Calibri" w:eastAsia="Calibri" w:hAnsi="Calibri"/>
+          <w:color w:val="333333"/>
+          <w:sz w:val="22"/>
+          <w:szCs w:val="22"/>
+        </w:rPr>
+        <w:t xml:space="preserve">Your tracking provider continues to work exactly as before — we're reading the data, not changing it</w:t>
+      </w:r>
+    </w:p>
+    <w:p>
+      <w:pPr>
+        <w:pStyle w:val="ListParagraph"/>
+        <w:numPr>
+          <w:ilvl w:val="0"/>
+          <w:numId w:val="1"/>
+        </w:numPr>
+        <w:spacing w:after="80"/>
+      </w:pPr>
+      <w:r>
+        <w:rPr>
+          <w:rFonts w:ascii="Calibri" w:cs="Calibri" w:eastAsia="Calibri" w:hAnsi="Calibri"/>
+          <w:color w:val="333333"/>
+          <w:sz w:val="22"/>
+          <w:szCs w:val="22"/>
+        </w:rPr>
+        <w:t xml:space="preserve">This is the fastest and cheapest approach — ideal for the pilot</w:t>
+      </w:r>
+    </w:p>
+    <w:p>
+      <w:pPr>
+        <w:spacing w:after="100"/>
+      </w:pPr>
+      <w:r>
+        <w:rPr>
+          <w:rFonts w:ascii="Calibri" w:cs="Calibri" w:eastAsia="Calibri" w:hAnsi="Calibri"/>
+          <w:b/>
+          <w:bCs/>
+          <w:color w:val="1a1a2e"/>
+          <w:sz w:val="22"/>
+          <w:szCs w:val="22"/>
+        </w:rPr>
+        <w:t xml:space="preserve">Option B: Driver Smartphone App</w:t>
+      </w:r>
+    </w:p>
+    <w:p>
+      <w:pPr>
+        <w:spacing w:after="120"/>
+      </w:pPr>
+      <w:r>
+        <w:rPr>
+          <w:rFonts w:ascii="Calibri" w:cs="Calibri" w:eastAsia="Calibri" w:hAnsi="Calibri"/>
+          <w:color w:val="333333"/>
+          <w:sz w:val="22"/>
+          <w:szCs w:val="22"/>
+        </w:rPr>
+        <w:t xml:space="preserve">If API access isn't available from your tracking provider, we install a lightweight app on each pilot driver's smartphone. The app runs in the background and provides:</w:t>
+      </w:r>
+    </w:p>
+    <w:p>
+      <w:pPr>
+        <w:pStyle w:val="ListParagraph"/>
+        <w:numPr>
+          <w:ilvl w:val="0"/>
+          <w:numId w:val="1"/>
+        </w:numPr>
+        <w:spacing w:after="80"/>
+      </w:pPr>
+      <w:r>
+        <w:rPr>
+          <w:rFonts w:ascii="Calibri" w:cs="Calibri" w:eastAsia="Calibri" w:hAnsi="Calibri"/>
+          <w:color w:val="333333"/>
+          <w:sz w:val="22"/>
+          <w:szCs w:val="22"/>
+        </w:rPr>
+        <w:t xml:space="preserve">GPS location updates every 5–10 seconds (uses minimal battery and data)</w:t>
+      </w:r>
+    </w:p>
+    <w:p>
+      <w:pPr>
+        <w:pStyle w:val="ListParagraph"/>
+        <w:numPr>
+          <w:ilvl w:val="0"/>
+          <w:numId w:val="1"/>
+        </w:numPr>
+        <w:spacing w:after="80"/>
+      </w:pPr>
+      <w:r>
+        <w:rPr>
+          <w:rFonts w:ascii="Calibri" w:cs="Calibri" w:eastAsia="Calibri" w:hAnsi="Calibri"/>
+          <w:color w:val="333333"/>
+          <w:sz w:val="22"/>
+          <w:szCs w:val="22"/>
+        </w:rPr>
+        <w:t xml:space="preserve">Accelerometer data — detects sudden stops, impacts, unusual movement patterns</w:t>
+      </w:r>
+    </w:p>
+    <w:p>
+      <w:pPr>
+        <w:pStyle w:val="ListParagraph"/>
+        <w:numPr>
+          <w:ilvl w:val="0"/>
+          <w:numId w:val="1"/>
+        </w:numPr>
+        <w:spacing w:after="80"/>
+      </w:pPr>
+      <w:r>
+        <w:rPr>
+          <w:rFonts w:ascii="Calibri" w:cs="Calibri" w:eastAsia="Calibri" w:hAnsi="Calibri"/>
+          <w:color w:val="333333"/>
+          <w:sz w:val="22"/>
+          <w:szCs w:val="22"/>
+        </w:rPr>
+        <w:t xml:space="preserve">Bluetooth connectivity — detects if the driver's phone separates from the vehicle</w:t>
+      </w:r>
+    </w:p>
+    <w:p>
+      <w:pPr>
+        <w:pStyle w:val="ListParagraph"/>
+        <w:numPr>
+          <w:ilvl w:val="0"/>
+          <w:numId w:val="1"/>
+        </w:numPr>
+        <w:spacing w:after="80"/>
+      </w:pPr>
+      <w:r>
+        <w:rPr>
+          <w:rFonts w:ascii="Calibri" w:cs="Calibri" w:eastAsia="Calibri" w:hAnsi="Calibri"/>
+          <w:color w:val="333333"/>
+          <w:sz w:val="22"/>
+          <w:szCs w:val="22"/>
+        </w:rPr>
+        <w:t xml:space="preserve">Network status monitoring — detects if cellular signal is being jammed</w:t>
+      </w:r>
+    </w:p>
+    <w:p>
+      <w:pPr>
+        <w:pStyle w:val="ListParagraph"/>
+        <w:numPr>
+          <w:ilvl w:val="0"/>
+          <w:numId w:val="1"/>
+        </w:numPr>
+        <w:spacing w:after="80"/>
+      </w:pPr>
+      <w:r>
+        <w:rPr>
+          <w:rFonts w:ascii="Calibri" w:cs="Calibri" w:eastAsia="Calibri" w:hAnsi="Calibri"/>
+          <w:color w:val="333333"/>
+          <w:sz w:val="22"/>
+          <w:szCs w:val="22"/>
+        </w:rPr>
+        <w:t xml:space="preserve">The app is simple — drivers open it at the start of their shift, and it runs silently in the background</w:t>
+      </w:r>
+    </w:p>
+    <w:p>
+      <w:pPr>
+        <w:spacing w:after="100"/>
+      </w:pPr>
+      <w:r>
+        <w:rPr>
+          <w:rFonts w:ascii="Calibri" w:cs="Calibri" w:eastAsia="Calibri" w:hAnsi="Calibri"/>
+          <w:b/>
+          <w:bCs/>
+          <w:color w:val="1a1a2e"/>
+          <w:sz w:val="22"/>
+          <w:szCs w:val="22"/>
+        </w:rPr>
+        <w:t xml:space="preserve">Option C: Dedicated OBD-II Device (for maximum data)</w:t>
+      </w:r>
+    </w:p>
+    <w:p>
+      <w:pPr>
+        <w:spacing w:after="120"/>
+      </w:pPr>
+      <w:r>
+        <w:rPr>
+          <w:rFonts w:ascii="Calibri" w:cs="Calibri" w:eastAsia="Calibri" w:hAnsi="Calibri"/>
+          <w:color w:val="333333"/>
+          <w:sz w:val="22"/>
+          <w:szCs w:val="22"/>
+        </w:rPr>
+        <w:t xml:space="preserve">For vehicles where you want the richest data, a small plug-in device connects to the vehicle's OBD-II diagnostic port (the same port mechanics use to read fault codes). This device provides:</w:t>
+      </w:r>
+    </w:p>
+    <w:p>
+      <w:pPr>
+        <w:pStyle w:val="ListParagraph"/>
+        <w:numPr>
+          <w:ilvl w:val="0"/>
+          <w:numId w:val="1"/>
+        </w:numPr>
+        <w:spacing w:after="80"/>
+      </w:pPr>
+      <w:r>
+        <w:rPr>
+          <w:rFonts w:ascii="Calibri" w:cs="Calibri" w:eastAsia="Calibri" w:hAnsi="Calibri"/>
+          <w:color w:val="333333"/>
+          <w:sz w:val="22"/>
+          <w:szCs w:val="22"/>
+        </w:rPr>
+        <w:t xml:space="preserve">Real-time vehicle telemetry — engine RPM, fuel level, ignition, door locks, speed</w:t>
+      </w:r>
+    </w:p>
+    <w:p>
+      <w:pPr>
+        <w:pStyle w:val="ListParagraph"/>
+        <w:numPr>
+          <w:ilvl w:val="0"/>
+          <w:numId w:val="1"/>
+        </w:numPr>
+        <w:spacing w:after="80"/>
+      </w:pPr>
+      <w:r>
+        <w:rPr>
+          <w:rFonts w:ascii="Calibri" w:cs="Calibri" w:eastAsia="Calibri" w:hAnsi="Calibri"/>
+          <w:color w:val="333333"/>
+          <w:sz w:val="22"/>
+          <w:szCs w:val="22"/>
+        </w:rPr>
+        <w:t xml:space="preserve">Independent GPS — works even if the existing tracker is jammed or disabled</w:t>
+      </w:r>
+    </w:p>
+    <w:p>
+      <w:pPr>
+        <w:pStyle w:val="ListParagraph"/>
+        <w:numPr>
+          <w:ilvl w:val="0"/>
+          <w:numId w:val="1"/>
+        </w:numPr>
+        <w:spacing w:after="80"/>
+      </w:pPr>
+      <w:r>
+        <w:rPr>
+          <w:rFonts w:ascii="Calibri" w:cs="Calibri" w:eastAsia="Calibri" w:hAnsi="Calibri"/>
+          <w:color w:val="333333"/>
+          <w:sz w:val="22"/>
+          <w:szCs w:val="22"/>
+        </w:rPr>
+        <w:t xml:space="preserve">Independent cellular connection — a separate SIM card so the AI has its own communication path</w:t>
+      </w:r>
+    </w:p>
+    <w:p>
+      <w:pPr>
+        <w:pStyle w:val="ListParagraph"/>
+        <w:numPr>
+          <w:ilvl w:val="0"/>
+          <w:numId w:val="1"/>
+        </w:numPr>
+        <w:spacing w:after="80"/>
+      </w:pPr>
+      <w:r>
+        <w:rPr>
+          <w:rFonts w:ascii="Calibri" w:cs="Calibri" w:eastAsia="Calibri" w:hAnsi="Calibri"/>
+          <w:color w:val="333333"/>
+          <w:sz w:val="22"/>
+          <w:szCs w:val="22"/>
+        </w:rPr>
+        <w:t xml:space="preserve">Tamper detection — alerts if someone tries to remove or disconnect the device</w:t>
+      </w:r>
+    </w:p>
+    <w:p>
+      <w:pPr>
+        <w:pStyle w:val="ListParagraph"/>
+        <w:numPr>
+          <w:ilvl w:val="0"/>
+          <w:numId w:val="1"/>
+        </w:numPr>
+        <w:spacing w:after="80"/>
+      </w:pPr>
+      <w:r>
+        <w:rPr>
+          <w:rFonts w:ascii="Calibri" w:cs="Calibri" w:eastAsia="Calibri" w:hAnsi="Calibri"/>
+          <w:color w:val="333333"/>
+          <w:sz w:val="22"/>
+          <w:szCs w:val="22"/>
+        </w:rPr>
+        <w:t xml:space="preserve">Cost: approximately R800–R1,500 per device — for the pilot, I'll cover this cost</w:t>
+      </w:r>
+    </w:p>
+    <w:p>
+      <w:pPr>
+        <w:spacing w:after="120"/>
+      </w:pPr>
+      <w:r>
+        <w:rPr>
+          <w:rFonts w:ascii="Calibri" w:cs="Calibri" w:eastAsia="Calibri" w:hAnsi="Calibri"/>
+          <w:color w:val="333333"/>
+          <w:sz w:val="22"/>
+          <w:szCs w:val="22"/>
+        </w:rPr>
+        <w:t xml:space="preserve">For Tragar's pilot, I'd recommend starting with Option A or B (zero or minimal cost) and adding Option C to 3–5 high-risk vehicles to demonstrate the full capability.</w:t>
+      </w:r>
+    </w:p>
+    <w:p>
+      <w:pPr>
+        <w:pBdr>
+          <w:bottom w:val="single" w:color="cccccc" w:sz="1"/>
+        </w:pBdr>
+        <w:spacing w:after="200" w:before="200"/>
+      </w:pPr>
+      <w:r>
+        <w:t xml:space="preserve"/>
+      </w:r>
+    </w:p>
+    <w:p>
+      <w:pPr>
+        <w:pStyle w:val="Heading2"/>
+        <w:spacing w:after="200" w:before="400"/>
+      </w:pPr>
+      <w:r>
+        <w:rPr>
+          <w:rFonts w:ascii="Calibri" w:cs="Calibri" w:eastAsia="Calibri" w:hAnsi="Calibri"/>
+          <w:b/>
+          <w:bCs/>
+          <w:color w:val="1a1a2e"/>
+        </w:rPr>
+        <w:t xml:space="preserve">Layer 2: The AI Brain — Cloud Processing</w:t>
+      </w:r>
+    </w:p>
+    <w:p>
+      <w:pPr>
+        <w:spacing w:after="120"/>
+      </w:pPr>
+      <w:r>
+        <w:rPr>
+          <w:rFonts w:ascii="Calibri" w:cs="Calibri" w:eastAsia="Calibri" w:hAnsi="Calibri"/>
+          <w:color w:val="333333"/>
+          <w:sz w:val="22"/>
+          <w:szCs w:val="22"/>
+        </w:rPr>
+        <w:t xml:space="preserve">All vehicle data feeds into a secure cloud-based AI engine. This is where the intelligence happens. Here's what it does with the data:</w:t>
+      </w:r>
+    </w:p>
+    <w:p>
+      <w:pPr>
+        <w:spacing w:after="100"/>
+      </w:pPr>
+      <w:r>
+        <w:rPr>
+          <w:rFonts w:ascii="Calibri" w:cs="Calibri" w:eastAsia="Calibri" w:hAnsi="Calibri"/>
+          <w:b/>
+          <w:bCs/>
+          <w:color w:val="1a1a2e"/>
+          <w:sz w:val="22"/>
+          <w:szCs w:val="22"/>
+        </w:rPr>
+        <w:t xml:space="preserve">Step 1: Build driver and route baselines (Week 1–4)</w:t>
+      </w:r>
+    </w:p>
+    <w:p>
+      <w:pPr>
+        <w:pStyle w:val="ListParagraph"/>
+        <w:numPr>
+          <w:ilvl w:val="0"/>
+          <w:numId w:val="1"/>
+        </w:numPr>
+        <w:spacing w:after="80"/>
+      </w:pPr>
+      <w:r>
+        <w:rPr>
+          <w:rFonts w:ascii="Calibri" w:cs="Calibri" w:eastAsia="Calibri" w:hAnsi="Calibri"/>
+          <w:color w:val="333333"/>
+          <w:sz w:val="22"/>
+          <w:szCs w:val="22"/>
+        </w:rPr>
+        <w:t xml:space="preserve">The AI watches each driver's normal patterns — which routes they take, how fast they drive on different roads, where they typically stop, how long deliveries take</w:t>
+      </w:r>
+    </w:p>
+    <w:p>
+      <w:pPr>
+        <w:pStyle w:val="ListParagraph"/>
+        <w:numPr>
+          <w:ilvl w:val="0"/>
+          <w:numId w:val="1"/>
+        </w:numPr>
+        <w:spacing w:after="80"/>
+      </w:pPr>
+      <w:r>
+        <w:rPr>
+          <w:rFonts w:ascii="Calibri" w:cs="Calibri" w:eastAsia="Calibri" w:hAnsi="Calibri"/>
+          <w:color w:val="333333"/>
+          <w:sz w:val="22"/>
+          <w:szCs w:val="22"/>
+        </w:rPr>
+        <w:t xml:space="preserve">It builds a unique behavioural profile for each driver — Driver A always takes the N1, stops at Engen for 12 minutes, averages 80km/h on the highway</w:t>
+      </w:r>
+    </w:p>
+    <w:p>
+      <w:pPr>
+        <w:pStyle w:val="ListParagraph"/>
+        <w:numPr>
+          <w:ilvl w:val="0"/>
+          <w:numId w:val="1"/>
+        </w:numPr>
+        <w:spacing w:after="80"/>
+      </w:pPr>
+      <w:r>
+        <w:rPr>
+          <w:rFonts w:ascii="Calibri" w:cs="Calibri" w:eastAsia="Calibri" w:hAnsi="Calibri"/>
+          <w:color w:val="333333"/>
+          <w:sz w:val="22"/>
+          <w:szCs w:val="22"/>
+        </w:rPr>
+        <w:t xml:space="preserve">It maps Tragar's common routes and identifies normal vs unusual corridors</w:t>
+      </w:r>
+    </w:p>
+    <w:p>
+      <w:pPr>
+        <w:pStyle w:val="ListParagraph"/>
+        <w:numPr>
+          <w:ilvl w:val="0"/>
+          <w:numId w:val="1"/>
+        </w:numPr>
+        <w:spacing w:after="80"/>
+      </w:pPr>
+      <w:r>
+        <w:rPr>
+          <w:rFonts w:ascii="Calibri" w:cs="Calibri" w:eastAsia="Calibri" w:hAnsi="Calibri"/>
+          <w:color w:val="333333"/>
+          <w:sz w:val="22"/>
+          <w:szCs w:val="22"/>
+        </w:rPr>
+        <w:t xml:space="preserve">It ingests publicly available crime data — SAPS crime statistics, historical hijacking hotspots, time-of-day patterns</w:t>
+      </w:r>
+    </w:p>
+    <w:p>
+      <w:pPr>
+        <w:spacing w:after="100"/>
+      </w:pPr>
+      <w:r>
+        <w:rPr>
+          <w:rFonts w:ascii="Calibri" w:cs="Calibri" w:eastAsia="Calibri" w:hAnsi="Calibri"/>
+          <w:b/>
+          <w:bCs/>
+          <w:color w:val="1a1a2e"/>
+          <w:sz w:val="22"/>
+          <w:szCs w:val="22"/>
+        </w:rPr>
+        <w:t xml:space="preserve">Step 2: Real-time anomaly detection (Week 5 onwards)</w:t>
+      </w:r>
+    </w:p>
+    <w:p>
+      <w:pPr>
+        <w:spacing w:after="120"/>
+      </w:pPr>
+      <w:r>
+        <w:rPr>
+          <w:rFonts w:ascii="Calibri" w:cs="Calibri" w:eastAsia="Calibri" w:hAnsi="Calibri"/>
+          <w:color w:val="333333"/>
+          <w:sz w:val="22"/>
+          <w:szCs w:val="22"/>
+        </w:rPr>
+        <w:t xml:space="preserve">Once baselines are established, the AI compares every live data point against what it expects:</w:t>
+      </w:r>
+    </w:p>
+    <w:p>
+      <w:pPr>
+        <w:pStyle w:val="ListParagraph"/>
+        <w:numPr>
+          <w:ilvl w:val="0"/>
+          <w:numId w:val="1"/>
+        </w:numPr>
+        <w:spacing w:after="80"/>
+      </w:pPr>
+      <w:r>
+        <w:rPr>
+          <w:rFonts w:ascii="Calibri" w:cs="Calibri" w:eastAsia="Calibri" w:hAnsi="Calibri"/>
+          <w:color w:val="333333"/>
+          <w:sz w:val="22"/>
+          <w:szCs w:val="22"/>
+        </w:rPr>
+        <w:t xml:space="preserve">Is this driver on their expected route? If not, how far off and in which direction?</w:t>
+      </w:r>
+    </w:p>
+    <w:p>
+      <w:pPr>
+        <w:pStyle w:val="ListParagraph"/>
+        <w:numPr>
+          <w:ilvl w:val="0"/>
+          <w:numId w:val="1"/>
+        </w:numPr>
+        <w:spacing w:after="80"/>
+      </w:pPr>
+      <w:r>
+        <w:rPr>
+          <w:rFonts w:ascii="Calibri" w:cs="Calibri" w:eastAsia="Calibri" w:hAnsi="Calibri"/>
+          <w:color w:val="333333"/>
+          <w:sz w:val="22"/>
+          <w:szCs w:val="22"/>
+        </w:rPr>
+        <w:t xml:space="preserve">Has the vehicle stopped in an unusual place? How long has it been stationary?</w:t>
+      </w:r>
+    </w:p>
+    <w:p>
+      <w:pPr>
+        <w:pStyle w:val="ListParagraph"/>
+        <w:numPr>
+          <w:ilvl w:val="0"/>
+          <w:numId w:val="1"/>
+        </w:numPr>
+        <w:spacing w:after="80"/>
+      </w:pPr>
+      <w:r>
+        <w:rPr>
+          <w:rFonts w:ascii="Calibri" w:cs="Calibri" w:eastAsia="Calibri" w:hAnsi="Calibri"/>
+          <w:color w:val="333333"/>
+          <w:sz w:val="22"/>
+          <w:szCs w:val="22"/>
+        </w:rPr>
+        <w:t xml:space="preserve">Is the driver's phone still with the vehicle? If it suddenly disappears, that's a red flag</w:t>
+      </w:r>
+    </w:p>
+    <w:p>
+      <w:pPr>
+        <w:pStyle w:val="ListParagraph"/>
+        <w:numPr>
+          <w:ilvl w:val="0"/>
+          <w:numId w:val="1"/>
+        </w:numPr>
+        <w:spacing w:after="80"/>
+      </w:pPr>
+      <w:r>
+        <w:rPr>
+          <w:rFonts w:ascii="Calibri" w:cs="Calibri" w:eastAsia="Calibri" w:hAnsi="Calibri"/>
+          <w:color w:val="333333"/>
+          <w:sz w:val="22"/>
+          <w:szCs w:val="22"/>
+        </w:rPr>
+        <w:t xml:space="preserve">Is the vehicle in or near a known crime hotspot? Is it the time of day when incidents typically occur?</w:t>
+      </w:r>
+    </w:p>
+    <w:p>
+      <w:pPr>
+        <w:pStyle w:val="ListParagraph"/>
+        <w:numPr>
+          <w:ilvl w:val="0"/>
+          <w:numId w:val="1"/>
+        </w:numPr>
+        <w:spacing w:after="80"/>
+      </w:pPr>
+      <w:r>
+        <w:rPr>
+          <w:rFonts w:ascii="Calibri" w:cs="Calibri" w:eastAsia="Calibri" w:hAnsi="Calibri"/>
+          <w:color w:val="333333"/>
+          <w:sz w:val="22"/>
+          <w:szCs w:val="22"/>
+        </w:rPr>
+        <w:t xml:space="preserve">Has cellular signal dropped? Is the vehicle still moving without any communication?</w:t>
+      </w:r>
+    </w:p>
+    <w:p>
+      <w:pPr>
+        <w:spacing w:after="120"/>
+      </w:pPr>
+      <w:r>
+        <w:rPr>
+          <w:rFonts w:ascii="Calibri" w:cs="Calibri" w:eastAsia="Calibri" w:hAnsi="Calibri"/>
+          <w:color w:val="333333"/>
+          <w:sz w:val="22"/>
+          <w:szCs w:val="22"/>
+        </w:rPr>
+        <w:t xml:space="preserve">Each of these factors is scored individually. The AI combines them into a single threat score from 0 (normal) to 100 (critical). When the score crosses defined thresholds, alerts are triggered.</w:t>
+      </w:r>
+    </w:p>
+    <w:p>
+      <w:pPr>
+        <w:spacing w:after="100"/>
+      </w:pPr>
+      <w:r>
+        <w:rPr>
+          <w:rFonts w:ascii="Calibri" w:cs="Calibri" w:eastAsia="Calibri" w:hAnsi="Calibri"/>
+          <w:b/>
+          <w:bCs/>
+          <w:color w:val="1a1a2e"/>
+          <w:sz w:val="22"/>
+          <w:szCs w:val="22"/>
+        </w:rPr>
+        <w:t xml:space="preserve">Step 3: Threat scoring and decision engine</w:t>
+      </w:r>
+    </w:p>
+    <w:p>
+      <w:pPr>
+        <w:spacing w:after="120"/>
+      </w:pPr>
+      <w:r>
+        <w:rPr>
+          <w:rFonts w:ascii="Calibri" w:cs="Calibri" w:eastAsia="Calibri" w:hAnsi="Calibri"/>
+          <w:color w:val="333333"/>
+          <w:sz w:val="22"/>
+          <w:szCs w:val="22"/>
+        </w:rPr>
+        <w:t xml:space="preserve">The AI doesn't just trigger alerts on single events — it combines multiple signals intelligently:</w:t>
+      </w:r>
+    </w:p>
+    <w:tbl>
+      <w:tblPr>
+        <w:tblW w:type="pct" w:w="100%"/>
+        <w:tblBorders>
+          <w:top w:val="single" w:color="auto" w:sz="4"/>
+          <w:left w:val="single" w:color="auto" w:sz="4"/>
+          <w:bottom w:val="single" w:color="auto" w:sz="4"/>
+          <w:right w:val="single" w:color="auto" w:sz="4"/>
+          <w:insideH w:val="single" w:color="auto" w:sz="4"/>
+          <w:insideV w:val="single" w:color="auto" w:sz="4"/>
+        </w:tblBorders>
+      </w:tblPr>
+      <w:tblGrid>
+        <w:gridCol w:w="100"/>
+        <w:gridCol w:w="100"/>
+        <w:gridCol w:w="100"/>
+        <w:gridCol w:w="100"/>
+      </w:tblGrid>
+      <w:tr>
+        <w:tc>
+          <w:tcPr>
+            <w:tcW w:type="auto" w:w="100"/>
+            <w:shd w:fill="1a1a2e" w:color="1a1a2e" w:val="solid"/>
+          </w:tcPr>
+          <w:p>
+            <w:r>
+              <w:rPr>
+                <w:rFonts w:ascii="Calibri" w:cs="Calibri" w:eastAsia="Calibri" w:hAnsi="Calibri"/>
+                <w:b/>
+                <w:bCs/>
+                <w:color w:val="ffffff"/>
+                <w:sz w:val="20"/>
+                <w:szCs w:val="20"/>
+              </w:rPr>
+              <w:t xml:space="preserve">Threat Level</w:t>
+            </w:r>
+          </w:p>
+        </w:tc>
+        <w:tc>
+          <w:tcPr>
+            <w:tcW w:type="auto" w:w="100"/>
+            <w:shd w:fill="1a1a2e" w:color="1a1a2e" w:val="solid"/>
+          </w:tcPr>
+          <w:p>
+            <w:r>
+              <w:rPr>
+                <w:rFonts w:ascii="Calibri" w:cs="Calibri" w:eastAsia="Calibri" w:hAnsi="Calibri"/>
+                <w:b/>
+                <w:bCs/>
+                <w:color w:val="ffffff"/>
+                <w:sz w:val="20"/>
+                <w:szCs w:val="20"/>
+              </w:rPr>
+              <w:t xml:space="preserve">Score</w:t>
+            </w:r>
+          </w:p>
+        </w:tc>
+        <w:tc>
+          <w:tcPr>
+            <w:tcW w:type="auto" w:w="100"/>
+            <w:shd w:fill="1a1a2e" w:color="1a1a2e" w:val="solid"/>
+          </w:tcPr>
+          <w:p>
+            <w:r>
+              <w:rPr>
+                <w:rFonts w:ascii="Calibri" w:cs="Calibri" w:eastAsia="Calibri" w:hAnsi="Calibri"/>
+                <w:b/>
+                <w:bCs/>
+                <w:color w:val="ffffff"/>
+                <w:sz w:val="20"/>
+                <w:szCs w:val="20"/>
+              </w:rPr>
+              <w:t xml:space="preserve">What Triggered It</w:t>
+            </w:r>
+          </w:p>
+        </w:tc>
+        <w:tc>
+          <w:tcPr>
+            <w:tcW w:type="auto" w:w="100"/>
+            <w:shd w:fill="1a1a2e" w:color="1a1a2e" w:val="solid"/>
+          </w:tcPr>
+          <w:p>
+            <w:r>
+              <w:rPr>
+                <w:rFonts w:ascii="Calibri" w:cs="Calibri" w:eastAsia="Calibri" w:hAnsi="Calibri"/>
+                <w:b/>
+                <w:bCs/>
+                <w:color w:val="ffffff"/>
+                <w:sz w:val="20"/>
+                <w:szCs w:val="20"/>
+              </w:rPr>
+              <w:t xml:space="preserve">What Happens</w:t>
+            </w:r>
+          </w:p>
+        </w:tc>
+      </w:tr>
+      <w:tr>
+        <w:tc>
+          <w:tcPr>
+            <w:tcW w:type="auto" w:w="100"/>
+          </w:tcPr>
+          <w:p>
+            <w:r>
+              <w:rPr>
+                <w:rFonts w:ascii="Calibri" w:cs="Calibri" w:eastAsia="Calibri" w:hAnsi="Calibri"/>
+                <w:b w:val="false"/>
+                <w:bCs w:val="false"/>
+                <w:color w:val="333333"/>
+                <w:sz w:val="20"/>
+                <w:szCs w:val="20"/>
+              </w:rPr>
+              <w:t xml:space="preserve">Normal</w:t>
+            </w:r>
+          </w:p>
+        </w:tc>
+        <w:tc>
+          <w:tcPr>
+            <w:tcW w:type="auto" w:w="100"/>
+          </w:tcPr>
+          <w:p>
+            <w:r>
+              <w:rPr>
+                <w:rFonts w:ascii="Calibri" w:cs="Calibri" w:eastAsia="Calibri" w:hAnsi="Calibri"/>
+                <w:b w:val="false"/>
+                <w:bCs w:val="false"/>
+                <w:color w:val="333333"/>
+                <w:sz w:val="20"/>
+                <w:szCs w:val="20"/>
+              </w:rPr>
+              <w:t xml:space="preserve">0–20</w:t>
+            </w:r>
+          </w:p>
+        </w:tc>
+        <w:tc>
+          <w:tcPr>
+            <w:tcW w:type="auto" w:w="100"/>
+          </w:tcPr>
+          <w:p>
+            <w:r>
+              <w:rPr>
+                <w:rFonts w:ascii="Calibri" w:cs="Calibri" w:eastAsia="Calibri" w:hAnsi="Calibri"/>
+                <w:b w:val="false"/>
+                <w:bCs w:val="false"/>
+                <w:color w:val="333333"/>
+                <w:sz w:val="20"/>
+                <w:szCs w:val="20"/>
+              </w:rPr>
+              <w:t xml:space="preserve">Vehicle on expected route, normal speed, driver phone connected</w:t>
+            </w:r>
+          </w:p>
+        </w:tc>
+        <w:tc>
+          <w:tcPr>
+            <w:tcW w:type="auto" w:w="100"/>
+          </w:tcPr>
+          <w:p>
+            <w:r>
+              <w:rPr>
+                <w:rFonts w:ascii="Calibri" w:cs="Calibri" w:eastAsia="Calibri" w:hAnsi="Calibri"/>
+                <w:b w:val="false"/>
+                <w:bCs w:val="false"/>
+                <w:color w:val="333333"/>
+                <w:sz w:val="20"/>
+                <w:szCs w:val="20"/>
+              </w:rPr>
+              <w:t xml:space="preserve">No action — routine monitoring</w:t>
+            </w:r>
+          </w:p>
+        </w:tc>
+      </w:tr>
+      <w:tr>
+        <w:tc>
+          <w:tcPr>
+            <w:tcW w:type="auto" w:w="100"/>
+          </w:tcPr>
+          <w:p>
+            <w:r>
+              <w:rPr>
+                <w:rFonts w:ascii="Calibri" w:cs="Calibri" w:eastAsia="Calibri" w:hAnsi="Calibri"/>
+                <w:b w:val="false"/>
+                <w:bCs w:val="false"/>
+                <w:color w:val="333333"/>
+                <w:sz w:val="20"/>
+                <w:szCs w:val="20"/>
+              </w:rPr>
+              <w:t xml:space="preserve">Elevated</w:t>
+            </w:r>
+          </w:p>
+        </w:tc>
+        <w:tc>
+          <w:tcPr>
+            <w:tcW w:type="auto" w:w="100"/>
+          </w:tcPr>
+          <w:p>
+            <w:r>
+              <w:rPr>
+                <w:rFonts w:ascii="Calibri" w:cs="Calibri" w:eastAsia="Calibri" w:hAnsi="Calibri"/>
+                <w:b w:val="false"/>
+                <w:bCs w:val="false"/>
+                <w:color w:val="333333"/>
+                <w:sz w:val="20"/>
+                <w:szCs w:val="20"/>
+              </w:rPr>
+              <w:t xml:space="preserve">21–40</w:t>
+            </w:r>
+          </w:p>
+        </w:tc>
+        <w:tc>
+          <w:tcPr>
+            <w:tcW w:type="auto" w:w="100"/>
+          </w:tcPr>
+          <w:p>
+            <w:r>
+              <w:rPr>
+                <w:rFonts w:ascii="Calibri" w:cs="Calibri" w:eastAsia="Calibri" w:hAnsi="Calibri"/>
+                <w:b w:val="false"/>
+                <w:bCs w:val="false"/>
+                <w:color w:val="333333"/>
+                <w:sz w:val="20"/>
+                <w:szCs w:val="20"/>
+              </w:rPr>
+              <w:t xml:space="preserve">Minor route deviation OR unexpected stop — but only one factor</w:t>
+            </w:r>
+          </w:p>
+        </w:tc>
+        <w:tc>
+          <w:tcPr>
+            <w:tcW w:type="auto" w:w="100"/>
+          </w:tcPr>
+          <w:p>
+            <w:r>
+              <w:rPr>
+                <w:rFonts w:ascii="Calibri" w:cs="Calibri" w:eastAsia="Calibri" w:hAnsi="Calibri"/>
+                <w:b w:val="false"/>
+                <w:bCs w:val="false"/>
+                <w:color w:val="333333"/>
+                <w:sz w:val="20"/>
+                <w:szCs w:val="20"/>
+              </w:rPr>
+              <w:t xml:space="preserve">AI watches more closely, increases data collection frequency</w:t>
+            </w:r>
+          </w:p>
+        </w:tc>
+      </w:tr>
+      <w:tr>
+        <w:tc>
+          <w:tcPr>
+            <w:tcW w:type="auto" w:w="100"/>
+          </w:tcPr>
+          <w:p>
+            <w:r>
+              <w:rPr>
+                <w:rFonts w:ascii="Calibri" w:cs="Calibri" w:eastAsia="Calibri" w:hAnsi="Calibri"/>
+                <w:b w:val="false"/>
+                <w:bCs w:val="false"/>
+                <w:color w:val="333333"/>
+                <w:sz w:val="20"/>
+                <w:szCs w:val="20"/>
+              </w:rPr>
+              <w:t xml:space="preserve">Guarded</w:t>
+            </w:r>
+          </w:p>
+        </w:tc>
+        <w:tc>
+          <w:tcPr>
+            <w:tcW w:type="auto" w:w="100"/>
+          </w:tcPr>
+          <w:p>
+            <w:r>
+              <w:rPr>
+                <w:rFonts w:ascii="Calibri" w:cs="Calibri" w:eastAsia="Calibri" w:hAnsi="Calibri"/>
+                <w:b w:val="false"/>
+                <w:bCs w:val="false"/>
+                <w:color w:val="333333"/>
+                <w:sz w:val="20"/>
+                <w:szCs w:val="20"/>
+              </w:rPr>
+              <w:t xml:space="preserve">41–60</w:t>
+            </w:r>
+          </w:p>
+        </w:tc>
+        <w:tc>
+          <w:tcPr>
+            <w:tcW w:type="auto" w:w="100"/>
+          </w:tcPr>
+          <w:p>
+            <w:r>
+              <w:rPr>
+                <w:rFonts w:ascii="Calibri" w:cs="Calibri" w:eastAsia="Calibri" w:hAnsi="Calibri"/>
+                <w:b w:val="false"/>
+                <w:bCs w:val="false"/>
+                <w:color w:val="333333"/>
+                <w:sz w:val="20"/>
+                <w:szCs w:val="20"/>
+              </w:rPr>
+              <w:t xml:space="preserve">Route deviation PLUS unusual stop location — two factors combining</w:t>
+            </w:r>
+          </w:p>
+        </w:tc>
+        <w:tc>
+          <w:tcPr>
+            <w:tcW w:type="auto" w:w="100"/>
+          </w:tcPr>
+          <w:p>
+            <w:r>
+              <w:rPr>
+                <w:rFonts w:ascii="Calibri" w:cs="Calibri" w:eastAsia="Calibri" w:hAnsi="Calibri"/>
+                <w:b w:val="false"/>
+                <w:bCs w:val="false"/>
+                <w:color w:val="333333"/>
+                <w:sz w:val="20"/>
+                <w:szCs w:val="20"/>
+              </w:rPr>
+              <w:t xml:space="preserve">Silent alert to monitoring dashboard, log everything</w:t>
+            </w:r>
+          </w:p>
+        </w:tc>
+      </w:tr>
+      <w:tr>
+        <w:tc>
+          <w:tcPr>
+            <w:tcW w:type="auto" w:w="100"/>
+          </w:tcPr>
+          <w:p>
+            <w:r>
+              <w:rPr>
+                <w:rFonts w:ascii="Calibri" w:cs="Calibri" w:eastAsia="Calibri" w:hAnsi="Calibri"/>
+                <w:b w:val="false"/>
+                <w:bCs w:val="false"/>
+                <w:color w:val="333333"/>
+                <w:sz w:val="20"/>
+                <w:szCs w:val="20"/>
+              </w:rPr>
+              <w:t xml:space="preserve">High</w:t>
+            </w:r>
+          </w:p>
+        </w:tc>
+        <w:tc>
+          <w:tcPr>
+            <w:tcW w:type="auto" w:w="100"/>
+          </w:tcPr>
+          <w:p>
+            <w:r>
+              <w:rPr>
+                <w:rFonts w:ascii="Calibri" w:cs="Calibri" w:eastAsia="Calibri" w:hAnsi="Calibri"/>
+                <w:b w:val="false"/>
+                <w:bCs w:val="false"/>
+                <w:color w:val="333333"/>
+                <w:sz w:val="20"/>
+                <w:szCs w:val="20"/>
+              </w:rPr>
+              <w:t xml:space="preserve">61–80</w:t>
+            </w:r>
+          </w:p>
+        </w:tc>
+        <w:tc>
+          <w:tcPr>
+            <w:tcW w:type="auto" w:w="100"/>
+          </w:tcPr>
+          <w:p>
+            <w:r>
+              <w:rPr>
+                <w:rFonts w:ascii="Calibri" w:cs="Calibri" w:eastAsia="Calibri" w:hAnsi="Calibri"/>
+                <w:b w:val="false"/>
+                <w:bCs w:val="false"/>
+                <w:color w:val="333333"/>
+                <w:sz w:val="20"/>
+                <w:szCs w:val="20"/>
+              </w:rPr>
+              <w:t xml:space="preserve">Route deviation + driver phone offline + near crime hotspot</w:t>
+            </w:r>
+          </w:p>
+        </w:tc>
+        <w:tc>
+          <w:tcPr>
+            <w:tcW w:type="auto" w:w="100"/>
+          </w:tcPr>
+          <w:p>
+            <w:r>
+              <w:rPr>
+                <w:rFonts w:ascii="Calibri" w:cs="Calibri" w:eastAsia="Calibri" w:hAnsi="Calibri"/>
+                <w:b w:val="false"/>
+                <w:bCs w:val="false"/>
+                <w:color w:val="333333"/>
+                <w:sz w:val="20"/>
+                <w:szCs w:val="20"/>
+              </w:rPr>
+              <w:t xml:space="preserve">Alert to Tragar control room with live vehicle position</w:t>
+            </w:r>
+          </w:p>
+        </w:tc>
+      </w:tr>
+      <w:tr>
+        <w:tc>
+          <w:tcPr>
+            <w:tcW w:type="auto" w:w="100"/>
+          </w:tcPr>
+          <w:p>
+            <w:r>
+              <w:rPr>
+                <w:rFonts w:ascii="Calibri" w:cs="Calibri" w:eastAsia="Calibri" w:hAnsi="Calibri"/>
+                <w:b w:val="false"/>
+                <w:bCs w:val="false"/>
+                <w:color w:val="333333"/>
+                <w:sz w:val="20"/>
+                <w:szCs w:val="20"/>
+              </w:rPr>
+              <w:t xml:space="preserve">Critical</w:t>
+            </w:r>
+          </w:p>
+        </w:tc>
+        <w:tc>
+          <w:tcPr>
+            <w:tcW w:type="auto" w:w="100"/>
+          </w:tcPr>
+          <w:p>
+            <w:r>
+              <w:rPr>
+                <w:rFonts w:ascii="Calibri" w:cs="Calibri" w:eastAsia="Calibri" w:hAnsi="Calibri"/>
+                <w:b w:val="false"/>
+                <w:bCs w:val="false"/>
+                <w:color w:val="333333"/>
+                <w:sz w:val="20"/>
+                <w:szCs w:val="20"/>
+              </w:rPr>
+              <w:t xml:space="preserve">81–100</w:t>
+            </w:r>
+          </w:p>
+        </w:tc>
+        <w:tc>
+          <w:tcPr>
+            <w:tcW w:type="auto" w:w="100"/>
+          </w:tcPr>
+          <w:p>
+            <w:r>
+              <w:rPr>
+                <w:rFonts w:ascii="Calibri" w:cs="Calibri" w:eastAsia="Calibri" w:hAnsi="Calibri"/>
+                <w:b w:val="false"/>
+                <w:bCs w:val="false"/>
+                <w:color w:val="333333"/>
+                <w:sz w:val="20"/>
+                <w:szCs w:val="20"/>
+              </w:rPr>
+              <w:t xml:space="preserve">Multiple signals + vehicle moving toward known chop-shop area or signal jammed</w:t>
+            </w:r>
+          </w:p>
+        </w:tc>
+        <w:tc>
+          <w:tcPr>
+            <w:tcW w:type="auto" w:w="100"/>
+          </w:tcPr>
+          <w:p>
+            <w:r>
+              <w:rPr>
+                <w:rFonts w:ascii="Calibri" w:cs="Calibri" w:eastAsia="Calibri" w:hAnsi="Calibri"/>
+                <w:b w:val="false"/>
+                <w:bCs w:val="false"/>
+                <w:color w:val="333333"/>
+                <w:sz w:val="20"/>
+                <w:szCs w:val="20"/>
+              </w:rPr>
+              <w:t xml:space="preserve">Emergency escalation — control room + emergency contacts + evidence recording</w:t>
+            </w:r>
+          </w:p>
+        </w:tc>
+      </w:tr>
+    </w:tbl>
+    <w:p>
+      <w:pPr>
+        <w:pBdr>
+          <w:bottom w:val="single" w:color="cccccc" w:sz="1"/>
+        </w:pBdr>
+        <w:spacing w:after="200" w:before="200"/>
+      </w:pPr>
+      <w:r>
+        <w:t xml:space="preserve"/>
+      </w:r>
+    </w:p>
+    <w:p>
+      <w:pPr>
+        <w:pStyle w:val="Heading2"/>
+        <w:spacing w:after="200" w:before="400"/>
+      </w:pPr>
+      <w:r>
+        <w:rPr>
+          <w:rFonts w:ascii="Calibri" w:cs="Calibri" w:eastAsia="Calibri" w:hAnsi="Calibri"/>
+          <w:b/>
+          <w:bCs/>
+          <w:color w:val="1a1a2e"/>
+        </w:rPr>
+        <w:t xml:space="preserve">Layer 3: The Alert and Response System</w:t>
+      </w:r>
+    </w:p>
+    <w:p>
+      <w:pPr>
+        <w:spacing w:after="120"/>
+      </w:pPr>
+      <w:r>
+        <w:rPr>
+          <w:rFonts w:ascii="Calibri" w:cs="Calibri" w:eastAsia="Calibri" w:hAnsi="Calibri"/>
+          <w:color w:val="333333"/>
+          <w:sz w:val="22"/>
+          <w:szCs w:val="22"/>
+        </w:rPr>
+        <w:t xml:space="preserve">When the AI detects a threat, it escalates through a defined chain. This is customised for Tragar's operations:</w:t>
+      </w:r>
+    </w:p>
+    <w:p>
+      <w:pPr>
+        <w:spacing w:after="100"/>
+      </w:pPr>
+      <w:r>
+        <w:rPr>
+          <w:rFonts w:ascii="Calibri" w:cs="Calibri" w:eastAsia="Calibri" w:hAnsi="Calibri"/>
+          <w:b/>
+          <w:bCs/>
+          <w:color w:val="1a1a2e"/>
+          <w:sz w:val="22"/>
+          <w:szCs w:val="22"/>
+        </w:rPr>
+        <w:t xml:space="preserve">Alert Channel 1: Monitoring Dashboard</w:t>
+      </w:r>
+    </w:p>
+    <w:p>
+      <w:pPr>
+        <w:spacing w:after="120"/>
+      </w:pPr>
+      <w:r>
+        <w:rPr>
+          <w:rFonts w:ascii="Calibri" w:cs="Calibri" w:eastAsia="Calibri" w:hAnsi="Calibri"/>
+          <w:color w:val="333333"/>
+          <w:sz w:val="22"/>
+          <w:szCs w:val="22"/>
+        </w:rPr>
+        <w:t xml:space="preserve">A web-based dashboard accessible from any computer or tablet in Tragar's control room. It shows:</w:t>
+      </w:r>
+    </w:p>
+    <w:p>
+      <w:pPr>
+        <w:pStyle w:val="ListParagraph"/>
+        <w:numPr>
+          <w:ilvl w:val="0"/>
+          <w:numId w:val="1"/>
+        </w:numPr>
+        <w:spacing w:after="80"/>
+      </w:pPr>
+      <w:r>
+        <w:rPr>
+          <w:rFonts w:ascii="Calibri" w:cs="Calibri" w:eastAsia="Calibri" w:hAnsi="Calibri"/>
+          <w:color w:val="333333"/>
+          <w:sz w:val="22"/>
+          <w:szCs w:val="22"/>
+        </w:rPr>
+        <w:t xml:space="preserve">Live map of all pilot vehicles with colour-coded threat status (green/yellow/orange/red)</w:t>
+      </w:r>
+    </w:p>
+    <w:p>
+      <w:pPr>
+        <w:pStyle w:val="ListParagraph"/>
+        <w:numPr>
+          <w:ilvl w:val="0"/>
+          <w:numId w:val="1"/>
+        </w:numPr>
+        <w:spacing w:after="80"/>
+      </w:pPr>
+      <w:r>
+        <w:rPr>
+          <w:rFonts w:ascii="Calibri" w:cs="Calibri" w:eastAsia="Calibri" w:hAnsi="Calibri"/>
+          <w:color w:val="333333"/>
+          <w:sz w:val="22"/>
+          <w:szCs w:val="22"/>
+        </w:rPr>
+        <w:t xml:space="preserve">Alert feed showing real-time anomaly detections with context (why the alert was triggered)</w:t>
+      </w:r>
+    </w:p>
+    <w:p>
+      <w:pPr>
+        <w:pStyle w:val="ListParagraph"/>
+        <w:numPr>
+          <w:ilvl w:val="0"/>
+          <w:numId w:val="1"/>
+        </w:numPr>
+        <w:spacing w:after="80"/>
+      </w:pPr>
+      <w:r>
+        <w:rPr>
+          <w:rFonts w:ascii="Calibri" w:cs="Calibri" w:eastAsia="Calibri" w:hAnsi="Calibri"/>
+          <w:color w:val="333333"/>
+          <w:sz w:val="22"/>
+          <w:szCs w:val="22"/>
+        </w:rPr>
+        <w:t xml:space="preserve">Historical journey replays — see exactly what route a vehicle took and where anomalies occurred</w:t>
+      </w:r>
+    </w:p>
+    <w:p>
+      <w:pPr>
+        <w:pStyle w:val="ListParagraph"/>
+        <w:numPr>
+          <w:ilvl w:val="0"/>
+          <w:numId w:val="1"/>
+        </w:numPr>
+        <w:spacing w:after="80"/>
+      </w:pPr>
+      <w:r>
+        <w:rPr>
+          <w:rFonts w:ascii="Calibri" w:cs="Calibri" w:eastAsia="Calibri" w:hAnsi="Calibri"/>
+          <w:color w:val="333333"/>
+          <w:sz w:val="22"/>
+          <w:szCs w:val="22"/>
+        </w:rPr>
+        <w:t xml:space="preserve">Driver behaviour scorecards — which drivers are consistent, which have irregular patterns</w:t>
+      </w:r>
+    </w:p>
+    <w:p>
+      <w:pPr>
+        <w:spacing w:after="100"/>
+      </w:pPr>
+      <w:r>
+        <w:rPr>
+          <w:rFonts w:ascii="Calibri" w:cs="Calibri" w:eastAsia="Calibri" w:hAnsi="Calibri"/>
+          <w:b/>
+          <w:bCs/>
+          <w:color w:val="1a1a2e"/>
+          <w:sz w:val="22"/>
+          <w:szCs w:val="22"/>
+        </w:rPr>
+        <w:t xml:space="preserve">Alert Channel 2: Mobile Push Notifications</w:t>
+      </w:r>
+    </w:p>
+    <w:p>
+      <w:pPr>
+        <w:spacing w:after="120"/>
+      </w:pPr>
+      <w:r>
+        <w:rPr>
+          <w:rFonts w:ascii="Calibri" w:cs="Calibri" w:eastAsia="Calibri" w:hAnsi="Calibri"/>
+          <w:color w:val="333333"/>
+          <w:sz w:val="22"/>
+          <w:szCs w:val="22"/>
+        </w:rPr>
+        <w:t xml:space="preserve">Designated managers and operations staff receive instant push notifications on their phones when a High or Critical alert triggers. The notification includes:</w:t>
+      </w:r>
+    </w:p>
+    <w:p>
+      <w:pPr>
+        <w:pStyle w:val="ListParagraph"/>
+        <w:numPr>
+          <w:ilvl w:val="0"/>
+          <w:numId w:val="1"/>
+        </w:numPr>
+        <w:spacing w:after="80"/>
+      </w:pPr>
+      <w:r>
+        <w:rPr>
+          <w:rFonts w:ascii="Calibri" w:cs="Calibri" w:eastAsia="Calibri" w:hAnsi="Calibri"/>
+          <w:color w:val="333333"/>
+          <w:sz w:val="22"/>
+          <w:szCs w:val="22"/>
+        </w:rPr>
+        <w:t xml:space="preserve">Vehicle ID and driver name</w:t>
+      </w:r>
+    </w:p>
+    <w:p>
+      <w:pPr>
+        <w:pStyle w:val="ListParagraph"/>
+        <w:numPr>
+          <w:ilvl w:val="0"/>
+          <w:numId w:val="1"/>
+        </w:numPr>
+        <w:spacing w:after="80"/>
+      </w:pPr>
+      <w:r>
+        <w:rPr>
+          <w:rFonts w:ascii="Calibri" w:cs="Calibri" w:eastAsia="Calibri" w:hAnsi="Calibri"/>
+          <w:color w:val="333333"/>
+          <w:sz w:val="22"/>
+          <w:szCs w:val="22"/>
+        </w:rPr>
+        <w:t xml:space="preserve">Current location (with map link)</w:t>
+      </w:r>
+    </w:p>
+    <w:p>
+      <w:pPr>
+        <w:pStyle w:val="ListParagraph"/>
+        <w:numPr>
+          <w:ilvl w:val="0"/>
+          <w:numId w:val="1"/>
+        </w:numPr>
+        <w:spacing w:after="80"/>
+      </w:pPr>
+      <w:r>
+        <w:rPr>
+          <w:rFonts w:ascii="Calibri" w:cs="Calibri" w:eastAsia="Calibri" w:hAnsi="Calibri"/>
+          <w:color w:val="333333"/>
+          <w:sz w:val="22"/>
+          <w:szCs w:val="22"/>
+        </w:rPr>
+        <w:t xml:space="preserve">What triggered the alert (e.g., 'Route deviation + phone offline near Diepsloot corridor')</w:t>
+      </w:r>
+    </w:p>
+    <w:p>
+      <w:pPr>
+        <w:pStyle w:val="ListParagraph"/>
+        <w:numPr>
+          <w:ilvl w:val="0"/>
+          <w:numId w:val="1"/>
+        </w:numPr>
+        <w:spacing w:after="80"/>
+      </w:pPr>
+      <w:r>
+        <w:rPr>
+          <w:rFonts w:ascii="Calibri" w:cs="Calibri" w:eastAsia="Calibri" w:hAnsi="Calibri"/>
+          <w:color w:val="333333"/>
+          <w:sz w:val="22"/>
+          <w:szCs w:val="22"/>
+        </w:rPr>
+        <w:t xml:space="preserve">Recommended action (e.g., 'Attempt driver contact, prepare escalation')</w:t>
+      </w:r>
+    </w:p>
+    <w:p>
+      <w:pPr>
+        <w:spacing w:after="100"/>
+      </w:pPr>
+      <w:r>
+        <w:rPr>
+          <w:rFonts w:ascii="Calibri" w:cs="Calibri" w:eastAsia="Calibri" w:hAnsi="Calibri"/>
+          <w:b/>
+          <w:bCs/>
+          <w:color w:val="1a1a2e"/>
+          <w:sz w:val="22"/>
+          <w:szCs w:val="22"/>
+        </w:rPr>
+        <w:t xml:space="preserve">Alert Channel 3: SMS and WhatsApp Escalation</w:t>
+      </w:r>
+    </w:p>
+    <w:p>
+      <w:pPr>
+        <w:spacing w:after="120"/>
+      </w:pPr>
+      <w:r>
+        <w:rPr>
+          <w:rFonts w:ascii="Calibri" w:cs="Calibri" w:eastAsia="Calibri" w:hAnsi="Calibri"/>
+          <w:color w:val="333333"/>
+          <w:sz w:val="22"/>
+          <w:szCs w:val="22"/>
+        </w:rPr>
+        <w:t xml:space="preserve">If a Critical alert is not acknowledged within 3 minutes, the system automatically escalates via:</w:t>
+      </w:r>
+    </w:p>
+    <w:p>
+      <w:pPr>
+        <w:pStyle w:val="ListParagraph"/>
+        <w:numPr>
+          <w:ilvl w:val="0"/>
+          <w:numId w:val="1"/>
+        </w:numPr>
+        <w:spacing w:after="80"/>
+      </w:pPr>
+      <w:r>
+        <w:rPr>
+          <w:rFonts w:ascii="Calibri" w:cs="Calibri" w:eastAsia="Calibri" w:hAnsi="Calibri"/>
+          <w:color w:val="333333"/>
+          <w:sz w:val="22"/>
+          <w:szCs w:val="22"/>
+        </w:rPr>
+        <w:t xml:space="preserve">SMS to a pre-defined list of emergency contacts</w:t>
+      </w:r>
+    </w:p>
+    <w:p>
+      <w:pPr>
+        <w:pStyle w:val="ListParagraph"/>
+        <w:numPr>
+          <w:ilvl w:val="0"/>
+          <w:numId w:val="1"/>
+        </w:numPr>
+        <w:spacing w:after="80"/>
+      </w:pPr>
+      <w:r>
+        <w:rPr>
+          <w:rFonts w:ascii="Calibri" w:cs="Calibri" w:eastAsia="Calibri" w:hAnsi="Calibri"/>
+          <w:color w:val="333333"/>
+          <w:sz w:val="22"/>
+          <w:szCs w:val="22"/>
+        </w:rPr>
+        <w:t xml:space="preserve">WhatsApp message with live location sharing link</w:t>
+      </w:r>
+    </w:p>
+    <w:p>
+      <w:pPr>
+        <w:pStyle w:val="ListParagraph"/>
+        <w:numPr>
+          <w:ilvl w:val="0"/>
+          <w:numId w:val="1"/>
+        </w:numPr>
+        <w:spacing w:after="80"/>
+      </w:pPr>
+      <w:r>
+        <w:rPr>
+          <w:rFonts w:ascii="Calibri" w:cs="Calibri" w:eastAsia="Calibri" w:hAnsi="Calibri"/>
+          <w:color w:val="333333"/>
+          <w:sz w:val="22"/>
+          <w:szCs w:val="22"/>
+        </w:rPr>
+        <w:t xml:space="preserve">This ensures no critical alert goes unnoticed, even if the control room is unmanned</w:t>
+      </w:r>
+    </w:p>
+    <w:p>
+      <w:pPr>
+        <w:spacing w:after="100"/>
+      </w:pPr>
+      <w:r>
+        <w:rPr>
+          <w:rFonts w:ascii="Calibri" w:cs="Calibri" w:eastAsia="Calibri" w:hAnsi="Calibri"/>
+          <w:b/>
+          <w:bCs/>
+          <w:color w:val="1a1a2e"/>
+          <w:sz w:val="22"/>
+          <w:szCs w:val="22"/>
+        </w:rPr>
+        <w:t xml:space="preserve">Alert Channel 4: Emergency Services Integration (post-pilot)</w:t>
+      </w:r>
+    </w:p>
+    <w:p>
+      <w:pPr>
+        <w:spacing w:after="120"/>
+      </w:pPr>
+      <w:r>
+        <w:rPr>
+          <w:rFonts w:ascii="Calibri" w:cs="Calibri" w:eastAsia="Calibri" w:hAnsi="Calibri"/>
+          <w:color w:val="333333"/>
+          <w:sz w:val="22"/>
+          <w:szCs w:val="22"/>
+        </w:rPr>
+        <w:t xml:space="preserve">After the pilot proves the system works, we can integrate with armed response companies and SAPS to enable direct emergency dispatch when critical threats are confirmed. This is a phase 2 capability.</w:t>
+      </w:r>
+    </w:p>
+    <w:p>
+      <w:pPr>
+        <w:pBdr>
+          <w:bottom w:val="single" w:color="cccccc" w:sz="1"/>
+        </w:pBdr>
+        <w:spacing w:after="200" w:before="200"/>
+      </w:pPr>
+      <w:r>
+        <w:t xml:space="preserve"/>
+      </w:r>
+    </w:p>
+    <w:p>
+      <w:pPr>
+        <w:pStyle w:val="Heading2"/>
+        <w:spacing w:after="200" w:before="400"/>
+      </w:pPr>
+      <w:r>
+        <w:rPr>
+          <w:rFonts w:ascii="Calibri" w:cs="Calibri" w:eastAsia="Calibri" w:hAnsi="Calibri"/>
+          <w:b/>
+          <w:bCs/>
+          <w:color w:val="1a1a2e"/>
+        </w:rPr>
+        <w:t xml:space="preserve">Layer 4: Forensic Evidence Preservation</w:t>
+      </w:r>
+    </w:p>
+    <w:p>
+      <w:pPr>
+        <w:spacing w:after="120"/>
+      </w:pPr>
+      <w:r>
+        <w:rPr>
+          <w:rFonts w:ascii="Calibri" w:cs="Calibri" w:eastAsia="Calibri" w:hAnsi="Calibri"/>
+          <w:color w:val="333333"/>
+          <w:sz w:val="22"/>
+          <w:szCs w:val="22"/>
+        </w:rPr>
+        <w:t xml:space="preserve">If an incident occurs during the pilot, the system automatically generates a complete evidence package:</w:t>
+      </w:r>
+    </w:p>
+    <w:p>
+      <w:pPr>
+        <w:spacing w:after="100"/>
+      </w:pPr>
+      <w:r>
+        <w:rPr>
+          <w:rFonts w:ascii="Calibri" w:cs="Calibri" w:eastAsia="Calibri" w:hAnsi="Calibri"/>
+          <w:b/>
+          <w:bCs/>
+          <w:color w:val="1a1a2e"/>
+          <w:sz w:val="22"/>
+          <w:szCs w:val="22"/>
+        </w:rPr>
+        <w:t xml:space="preserve">What's captured:</w:t>
+      </w:r>
+    </w:p>
+    <w:p>
+      <w:pPr>
+        <w:pStyle w:val="ListParagraph"/>
+        <w:numPr>
+          <w:ilvl w:val="0"/>
+          <w:numId w:val="1"/>
+        </w:numPr>
+        <w:spacing w:after="80"/>
+      </w:pPr>
+      <w:r>
+        <w:rPr>
+          <w:rFonts w:ascii="Calibri" w:cs="Calibri" w:eastAsia="Calibri" w:hAnsi="Calibri"/>
+          <w:color w:val="333333"/>
+          <w:sz w:val="22"/>
+          <w:szCs w:val="22"/>
+        </w:rPr>
+        <w:t xml:space="preserve">High-frequency GPS breadcrumbs (every 2–5 seconds during an incident, vs every 30–60 seconds normally)</w:t>
+      </w:r>
+    </w:p>
+    <w:p>
+      <w:pPr>
+        <w:pStyle w:val="ListParagraph"/>
+        <w:numPr>
+          <w:ilvl w:val="0"/>
+          <w:numId w:val="1"/>
+        </w:numPr>
+        <w:spacing w:after="80"/>
+      </w:pPr>
+      <w:r>
+        <w:rPr>
+          <w:rFonts w:ascii="Calibri" w:cs="Calibri" w:eastAsia="Calibri" w:hAnsi="Calibri"/>
+          <w:color w:val="333333"/>
+          <w:sz w:val="22"/>
+          <w:szCs w:val="22"/>
+        </w:rPr>
+        <w:t xml:space="preserve">Complete timeline: exact time of first anomaly, escalation points, route taken, stops made</w:t>
+      </w:r>
+    </w:p>
+    <w:p>
+      <w:pPr>
+        <w:pStyle w:val="ListParagraph"/>
+        <w:numPr>
+          <w:ilvl w:val="0"/>
+          <w:numId w:val="1"/>
+        </w:numPr>
+        <w:spacing w:after="80"/>
+      </w:pPr>
+      <w:r>
+        <w:rPr>
+          <w:rFonts w:ascii="Calibri" w:cs="Calibri" w:eastAsia="Calibri" w:hAnsi="Calibri"/>
+          <w:color w:val="333333"/>
+          <w:sz w:val="22"/>
+          <w:szCs w:val="22"/>
+        </w:rPr>
+        <w:t xml:space="preserve">Communication log: when cellular signal was lost, when it returned, any jamming indicators</w:t>
+      </w:r>
+    </w:p>
+    <w:p>
+      <w:pPr>
+        <w:pStyle w:val="ListParagraph"/>
+        <w:numPr>
+          <w:ilvl w:val="0"/>
+          <w:numId w:val="1"/>
+        </w:numPr>
+        <w:spacing w:after="80"/>
+      </w:pPr>
+      <w:r>
+        <w:rPr>
+          <w:rFonts w:ascii="Calibri" w:cs="Calibri" w:eastAsia="Calibri" w:hAnsi="Calibri"/>
+          <w:color w:val="333333"/>
+          <w:sz w:val="22"/>
+          <w:szCs w:val="22"/>
+        </w:rPr>
+        <w:t xml:space="preserve">Device integrity: was the tracker tampered with, was the OBD device disconnected</w:t>
+      </w:r>
+    </w:p>
+    <w:p>
+      <w:pPr>
+        <w:pStyle w:val="ListParagraph"/>
+        <w:numPr>
+          <w:ilvl w:val="0"/>
+          <w:numId w:val="1"/>
+        </w:numPr>
+        <w:spacing w:after="80"/>
+      </w:pPr>
+      <w:r>
+        <w:rPr>
+          <w:rFonts w:ascii="Calibri" w:cs="Calibri" w:eastAsia="Calibri" w:hAnsi="Calibri"/>
+          <w:color w:val="333333"/>
+          <w:sz w:val="22"/>
+          <w:szCs w:val="22"/>
+        </w:rPr>
+        <w:t xml:space="preserve">Environmental context: was the vehicle in a known hotspot, what time of day, what day of week</w:t>
+      </w:r>
+    </w:p>
+    <w:p>
+      <w:pPr>
+        <w:spacing w:after="100"/>
+      </w:pPr>
+      <w:r>
+        <w:rPr>
+          <w:rFonts w:ascii="Calibri" w:cs="Calibri" w:eastAsia="Calibri" w:hAnsi="Calibri"/>
+          <w:b/>
+          <w:bCs/>
+          <w:color w:val="1a1a2e"/>
+          <w:sz w:val="22"/>
+          <w:szCs w:val="22"/>
+        </w:rPr>
+        <w:t xml:space="preserve">How it's secured:</w:t>
+      </w:r>
+    </w:p>
+    <w:p>
+      <w:pPr>
+        <w:pStyle w:val="ListParagraph"/>
+        <w:numPr>
+          <w:ilvl w:val="0"/>
+          <w:numId w:val="1"/>
+        </w:numPr>
+        <w:spacing w:after="80"/>
+      </w:pPr>
+      <w:r>
+        <w:rPr>
+          <w:rFonts w:ascii="Calibri" w:cs="Calibri" w:eastAsia="Calibri" w:hAnsi="Calibri"/>
+          <w:color w:val="333333"/>
+          <w:sz w:val="22"/>
+          <w:szCs w:val="22"/>
+        </w:rPr>
+        <w:t xml:space="preserve">Every data point is cryptographically hashed — this means it's mathematically impossible to alter the data after the fact</w:t>
+      </w:r>
+    </w:p>
+    <w:p>
+      <w:pPr>
+        <w:pStyle w:val="ListParagraph"/>
+        <w:numPr>
+          <w:ilvl w:val="0"/>
+          <w:numId w:val="1"/>
+        </w:numPr>
+        <w:spacing w:after="80"/>
+      </w:pPr>
+      <w:r>
+        <w:rPr>
+          <w:rFonts w:ascii="Calibri" w:cs="Calibri" w:eastAsia="Calibri" w:hAnsi="Calibri"/>
+          <w:color w:val="333333"/>
+          <w:sz w:val="22"/>
+          <w:szCs w:val="22"/>
+        </w:rPr>
+        <w:t xml:space="preserve">The evidence package is timestamped and stored on multiple servers — it can't be deleted or modified</w:t>
+      </w:r>
+    </w:p>
+    <w:p>
+      <w:pPr>
+        <w:pStyle w:val="ListParagraph"/>
+        <w:numPr>
+          <w:ilvl w:val="0"/>
+          <w:numId w:val="1"/>
+        </w:numPr>
+        <w:spacing w:after="80"/>
+      </w:pPr>
+      <w:r>
+        <w:rPr>
+          <w:rFonts w:ascii="Calibri" w:cs="Calibri" w:eastAsia="Calibri" w:hAnsi="Calibri"/>
+          <w:color w:val="333333"/>
+          <w:sz w:val="22"/>
+          <w:szCs w:val="22"/>
+        </w:rPr>
+        <w:t xml:space="preserve">This produces a chain-of-custody grade evidence trail suitable for insurance claims, police reports, and legal proceedings</w:t>
+      </w:r>
+    </w:p>
+    <w:p>
+      <w:pPr>
+        <w:spacing w:after="100"/>
+      </w:pPr>
+      <w:r>
+        <w:rPr>
+          <w:rFonts w:ascii="Calibri" w:cs="Calibri" w:eastAsia="Calibri" w:hAnsi="Calibri"/>
+          <w:b/>
+          <w:bCs/>
+          <w:color w:val="1a1a2e"/>
+          <w:sz w:val="22"/>
+          <w:szCs w:val="22"/>
+        </w:rPr>
+        <w:t xml:space="preserve">Why this matters for Tragar:</w:t>
+      </w:r>
+    </w:p>
+    <w:p>
+      <w:pPr>
+        <w:spacing w:after="120"/>
+      </w:pPr>
+      <w:r>
+        <w:rPr>
+          <w:rFonts w:ascii="Calibri" w:cs="Calibri" w:eastAsia="Calibri" w:hAnsi="Calibri"/>
+          <w:color w:val="333333"/>
+          <w:sz w:val="22"/>
+          <w:szCs w:val="22"/>
+        </w:rPr>
+        <w:t xml:space="preserve">If a vehicle is hijacked, you'll have a complete, tamper-proof record of exactly what happened, when, and where. This eliminates disputes with insurers and provides SAPS with actionable intelligence. No other tracking system in South Africa currently offers this level of forensic evidence.</w:t>
+      </w:r>
+    </w:p>
+    <w:p>
+      <w:pPr>
+        <w:pBdr>
+          <w:bottom w:val="single" w:color="cccccc" w:sz="1"/>
+        </w:pBdr>
+        <w:spacing w:after="200" w:before="200"/>
+      </w:pPr>
+      <w:r>
+        <w:t xml:space="preserve"/>
+      </w:r>
+    </w:p>
+    <w:p>
+      <w:pPr>
+        <w:pStyle w:val="Heading2"/>
+        <w:spacing w:after="200" w:before="400"/>
+      </w:pPr>
+      <w:r>
+        <w:rPr>
+          <w:rFonts w:ascii="Calibri" w:cs="Calibri" w:eastAsia="Calibri" w:hAnsi="Calibri"/>
+          <w:b/>
+          <w:bCs/>
+          <w:color w:val="1a1a2e"/>
+        </w:rPr>
+        <w:t xml:space="preserve">Layer 5: Predictive Intelligence and Route Planning</w:t>
+      </w:r>
+    </w:p>
+    <w:p>
+      <w:pPr>
+        <w:spacing w:after="120"/>
+      </w:pPr>
+      <w:r>
+        <w:rPr>
+          <w:rFonts w:ascii="Calibri" w:cs="Calibri" w:eastAsia="Calibri" w:hAnsi="Calibri"/>
+          <w:color w:val="333333"/>
+          <w:sz w:val="22"/>
+          <w:szCs w:val="22"/>
+        </w:rPr>
+        <w:t xml:space="preserve">Beyond detecting incidents as they happen, the AI builds intelligence that helps prevent incidents before they occur:</w:t>
+      </w:r>
+    </w:p>
+    <w:p>
+      <w:pPr>
+        <w:spacing w:after="100"/>
+      </w:pPr>
+      <w:r>
+        <w:rPr>
+          <w:rFonts w:ascii="Calibri" w:cs="Calibri" w:eastAsia="Calibri" w:hAnsi="Calibri"/>
+          <w:b/>
+          <w:bCs/>
+          <w:color w:val="1a1a2e"/>
+          <w:sz w:val="22"/>
+          <w:szCs w:val="22"/>
+        </w:rPr>
+        <w:t xml:space="preserve">Crime hotspot mapping</w:t>
+      </w:r>
+    </w:p>
+    <w:p>
+      <w:pPr>
+        <w:pStyle w:val="ListParagraph"/>
+        <w:numPr>
+          <w:ilvl w:val="0"/>
+          <w:numId w:val="1"/>
+        </w:numPr>
+        <w:spacing w:after="80"/>
+      </w:pPr>
+      <w:r>
+        <w:rPr>
+          <w:rFonts w:ascii="Calibri" w:cs="Calibri" w:eastAsia="Calibri" w:hAnsi="Calibri"/>
+          <w:color w:val="333333"/>
+          <w:sz w:val="22"/>
+          <w:szCs w:val="22"/>
+        </w:rPr>
+        <w:t xml:space="preserve">The system ingests SAPS crime statistics, media reports, and (over time) data from all vehicles on the network to build a live crime risk map</w:t>
+      </w:r>
+    </w:p>
+    <w:p>
+      <w:pPr>
+        <w:pStyle w:val="ListParagraph"/>
+        <w:numPr>
+          <w:ilvl w:val="0"/>
+          <w:numId w:val="1"/>
+        </w:numPr>
+        <w:spacing w:after="80"/>
+      </w:pPr>
+      <w:r>
+        <w:rPr>
+          <w:rFonts w:ascii="Calibri" w:cs="Calibri" w:eastAsia="Calibri" w:hAnsi="Calibri"/>
+          <w:color w:val="333333"/>
+          <w:sz w:val="22"/>
+          <w:szCs w:val="22"/>
+        </w:rPr>
+        <w:t xml:space="preserve">High-risk areas are identified and updated continuously — not just based on last year's statistics, but on what's happening this week</w:t>
+      </w:r>
+    </w:p>
+    <w:p>
+      <w:pPr>
+        <w:spacing w:after="100"/>
+      </w:pPr>
+      <w:r>
+        <w:rPr>
+          <w:rFonts w:ascii="Calibri" w:cs="Calibri" w:eastAsia="Calibri" w:hAnsi="Calibri"/>
+          <w:b/>
+          <w:bCs/>
+          <w:color w:val="1a1a2e"/>
+          <w:sz w:val="22"/>
+          <w:szCs w:val="22"/>
+        </w:rPr>
+        <w:t xml:space="preserve">Time-based risk patterns</w:t>
+      </w:r>
+    </w:p>
+    <w:p>
+      <w:pPr>
+        <w:pStyle w:val="ListParagraph"/>
+        <w:numPr>
+          <w:ilvl w:val="0"/>
+          <w:numId w:val="1"/>
+        </w:numPr>
+        <w:spacing w:after="80"/>
+      </w:pPr>
+      <w:r>
+        <w:rPr>
+          <w:rFonts w:ascii="Calibri" w:cs="Calibri" w:eastAsia="Calibri" w:hAnsi="Calibri"/>
+          <w:color w:val="333333"/>
+          <w:sz w:val="22"/>
+          <w:szCs w:val="22"/>
+        </w:rPr>
+        <w:t xml:space="preserve">Hijackings follow patterns — specific times of day, days of the week, and even seasonal trends</w:t>
+      </w:r>
+    </w:p>
+    <w:p>
+      <w:pPr>
+        <w:pStyle w:val="ListParagraph"/>
+        <w:numPr>
+          <w:ilvl w:val="0"/>
+          <w:numId w:val="1"/>
+        </w:numPr>
+        <w:spacing w:after="80"/>
+      </w:pPr>
+      <w:r>
+        <w:rPr>
+          <w:rFonts w:ascii="Calibri" w:cs="Calibri" w:eastAsia="Calibri" w:hAnsi="Calibri"/>
+          <w:color w:val="333333"/>
+          <w:sz w:val="22"/>
+          <w:szCs w:val="22"/>
+        </w:rPr>
+        <w:t xml:space="preserve">The AI identifies these patterns and adjusts risk scoring accordingly (e.g., a delivery through Soweto at 18:00 on a Friday scores higher than the same route at 10:00 on a Tuesday)</w:t>
+      </w:r>
+    </w:p>
+    <w:p>
+      <w:pPr>
+        <w:spacing w:after="100"/>
+      </w:pPr>
+      <w:r>
+        <w:rPr>
+          <w:rFonts w:ascii="Calibri" w:cs="Calibri" w:eastAsia="Calibri" w:hAnsi="Calibri"/>
+          <w:b/>
+          <w:bCs/>
+          <w:color w:val="1a1a2e"/>
+          <w:sz w:val="22"/>
+          <w:szCs w:val="22"/>
+        </w:rPr>
+        <w:t xml:space="preserve">Route risk recommendations</w:t>
+      </w:r>
+    </w:p>
+    <w:p>
+      <w:pPr>
+        <w:spacing w:after="120"/>
+      </w:pPr>
+      <w:r>
+        <w:rPr>
+          <w:rFonts w:ascii="Calibri" w:cs="Calibri" w:eastAsia="Calibri" w:hAnsi="Calibri"/>
+          <w:color w:val="333333"/>
+          <w:sz w:val="22"/>
+          <w:szCs w:val="22"/>
+        </w:rPr>
+        <w:t xml:space="preserve">Before a journey starts, the system can provide:</w:t>
+      </w:r>
+    </w:p>
+    <w:p>
+      <w:pPr>
+        <w:pStyle w:val="ListParagraph"/>
+        <w:numPr>
+          <w:ilvl w:val="0"/>
+          <w:numId w:val="1"/>
+        </w:numPr>
+        <w:spacing w:after="80"/>
+      </w:pPr>
+      <w:r>
+        <w:rPr>
+          <w:rFonts w:ascii="Calibri" w:cs="Calibri" w:eastAsia="Calibri" w:hAnsi="Calibri"/>
+          <w:color w:val="333333"/>
+          <w:sz w:val="22"/>
+          <w:szCs w:val="22"/>
+        </w:rPr>
+        <w:t xml:space="preserve">A risk score for the planned route at the planned time</w:t>
+      </w:r>
+    </w:p>
+    <w:p>
+      <w:pPr>
+        <w:pStyle w:val="ListParagraph"/>
+        <w:numPr>
+          <w:ilvl w:val="0"/>
+          <w:numId w:val="1"/>
+        </w:numPr>
+        <w:spacing w:after="80"/>
+      </w:pPr>
+      <w:r>
+        <w:rPr>
+          <w:rFonts w:ascii="Calibri" w:cs="Calibri" w:eastAsia="Calibri" w:hAnsi="Calibri"/>
+          <w:color w:val="333333"/>
+          <w:sz w:val="22"/>
+          <w:szCs w:val="22"/>
+        </w:rPr>
+        <w:t xml:space="preserve">Alternative routes that reduce risk exposure</w:t>
+      </w:r>
+    </w:p>
+    <w:p>
+      <w:pPr>
+        <w:pStyle w:val="ListParagraph"/>
+        <w:numPr>
+          <w:ilvl w:val="0"/>
+          <w:numId w:val="1"/>
+        </w:numPr>
+        <w:spacing w:after="80"/>
+      </w:pPr>
+      <w:r>
+        <w:rPr>
+          <w:rFonts w:ascii="Calibri" w:cs="Calibri" w:eastAsia="Calibri" w:hAnsi="Calibri"/>
+          <w:color w:val="333333"/>
+          <w:sz w:val="22"/>
+          <w:szCs w:val="22"/>
+        </w:rPr>
+        <w:t xml:space="preserve">Specific corridor warnings (e.g., 'N12 between Daveyton and Springs has had 3 incidents this month — consider N17 alternative')</w:t>
+      </w:r>
+    </w:p>
+    <w:p>
+      <w:pPr>
+        <w:pStyle w:val="ListParagraph"/>
+        <w:numPr>
+          <w:ilvl w:val="0"/>
+          <w:numId w:val="1"/>
+        </w:numPr>
+        <w:spacing w:after="80"/>
+      </w:pPr>
+      <w:r>
+        <w:rPr>
+          <w:rFonts w:ascii="Calibri" w:cs="Calibri" w:eastAsia="Calibri" w:hAnsi="Calibri"/>
+          <w:color w:val="333333"/>
+          <w:sz w:val="22"/>
+          <w:szCs w:val="22"/>
+        </w:rPr>
+        <w:t xml:space="preserve">This information can be provided to dispatchers so they can make informed routing decisions</w:t>
+      </w:r>
+    </w:p>
+    <w:p>
+      <w:pPr>
+        <w:spacing w:after="100"/>
+      </w:pPr>
+      <w:r>
+        <w:rPr>
+          <w:rFonts w:ascii="Calibri" w:cs="Calibri" w:eastAsia="Calibri" w:hAnsi="Calibri"/>
+          <w:b/>
+          <w:bCs/>
+          <w:color w:val="1a1a2e"/>
+          <w:sz w:val="22"/>
+          <w:szCs w:val="22"/>
+        </w:rPr>
+        <w:t xml:space="preserve">Fleet intelligence (grows over time)</w:t>
+      </w:r>
+    </w:p>
+    <w:p>
+      <w:pPr>
+        <w:spacing w:after="120"/>
+      </w:pPr>
+      <w:r>
+        <w:rPr>
+          <w:rFonts w:ascii="Calibri" w:cs="Calibri" w:eastAsia="Calibri" w:hAnsi="Calibri"/>
+          <w:color w:val="333333"/>
+          <w:sz w:val="22"/>
+          <w:szCs w:val="22"/>
+        </w:rPr>
+        <w:t xml:space="preserve">As more vehicles join the network (beyond Tragar, across the industry), the intelligence improves for everyone:</w:t>
+      </w:r>
+    </w:p>
+    <w:p>
+      <w:pPr>
+        <w:pStyle w:val="ListParagraph"/>
+        <w:numPr>
+          <w:ilvl w:val="0"/>
+          <w:numId w:val="1"/>
+        </w:numPr>
+        <w:spacing w:after="80"/>
+      </w:pPr>
+      <w:r>
+        <w:rPr>
+          <w:rFonts w:ascii="Calibri" w:cs="Calibri" w:eastAsia="Calibri" w:hAnsi="Calibri"/>
+          <w:color w:val="333333"/>
+          <w:sz w:val="22"/>
+          <w:szCs w:val="22"/>
+        </w:rPr>
+        <w:t xml:space="preserve">If a vehicle from another fleet is hijacked on a route Tragar uses, Tragar's risk assessment for that route updates immediately</w:t>
+      </w:r>
+    </w:p>
+    <w:p>
+      <w:pPr>
+        <w:pStyle w:val="ListParagraph"/>
+        <w:numPr>
+          <w:ilvl w:val="0"/>
+          <w:numId w:val="1"/>
+        </w:numPr>
+        <w:spacing w:after="80"/>
+      </w:pPr>
+      <w:r>
+        <w:rPr>
+          <w:rFonts w:ascii="Calibri" w:cs="Calibri" w:eastAsia="Calibri" w:hAnsi="Calibri"/>
+          <w:color w:val="333333"/>
+          <w:sz w:val="22"/>
+          <w:szCs w:val="22"/>
+        </w:rPr>
+        <w:t xml:space="preserve">This creates a community defence network — each vehicle makes the system smarter for all users</w:t>
+      </w:r>
+    </w:p>
+    <w:p>
+      <w:pPr>
+        <w:pBdr>
+          <w:bottom w:val="single" w:color="cccccc" w:sz="1"/>
+        </w:pBdr>
+        <w:spacing w:after="200" w:before="200"/>
+      </w:pPr>
+      <w:r>
+        <w:t xml:space="preserve"/>
+      </w:r>
+    </w:p>
+    <w:p>
+      <w:pPr>
+        <w:pStyle w:val="Heading2"/>
+        <w:spacing w:after="200" w:before="400"/>
+      </w:pPr>
+      <w:r>
+        <w:rPr>
+          <w:rFonts w:ascii="Calibri" w:cs="Calibri" w:eastAsia="Calibri" w:hAnsi="Calibri"/>
+          <w:b/>
+          <w:bCs/>
+          <w:color w:val="1a1a2e"/>
+        </w:rPr>
+        <w:t xml:space="preserve">System Architecture Summary</w:t>
+      </w:r>
+    </w:p>
+    <w:p>
+      <w:pPr>
+        <w:spacing w:after="120"/>
+      </w:pPr>
+      <w:r>
+        <w:rPr>
+          <w:rFonts w:ascii="Calibri" w:cs="Calibri" w:eastAsia="Calibri" w:hAnsi="Calibri"/>
+          <w:color w:val="333333"/>
+          <w:sz w:val="22"/>
+          <w:szCs w:val="22"/>
+        </w:rPr>
+        <w:t xml:space="preserve">Here is how all five layers work together:</w:t>
+      </w:r>
+    </w:p>
+    <w:tbl>
+      <w:tblPr>
+        <w:tblW w:type="pct" w:w="100%"/>
+        <w:tblBorders>
+          <w:top w:val="single" w:color="auto" w:sz="4"/>
+          <w:left w:val="single" w:color="auto" w:sz="4"/>
+          <w:bottom w:val="single" w:color="auto" w:sz="4"/>
+          <w:right w:val="single" w:color="auto" w:sz="4"/>
+          <w:insideH w:val="single" w:color="auto" w:sz="4"/>
+          <w:insideV w:val="single" w:color="auto" w:sz="4"/>
+        </w:tblBorders>
+      </w:tblPr>
+      <w:tblGrid>
+        <w:gridCol w:w="100"/>
+        <w:gridCol w:w="100"/>
+        <w:gridCol w:w="100"/>
+        <w:gridCol w:w="100"/>
+      </w:tblGrid>
+      <w:tr>
+        <w:tc>
+          <w:tcPr>
+            <w:tcW w:type="auto" w:w="100"/>
+            <w:shd w:fill="1a1a2e" w:color="1a1a2e" w:val="solid"/>
+          </w:tcPr>
+          <w:p>
+            <w:r>
+              <w:rPr>
+                <w:rFonts w:ascii="Calibri" w:cs="Calibri" w:eastAsia="Calibri" w:hAnsi="Calibri"/>
+                <w:b/>
+                <w:bCs/>
+                <w:color w:val="ffffff"/>
+                <w:sz w:val="20"/>
+                <w:szCs w:val="20"/>
+              </w:rPr>
+              <w:t xml:space="preserve">Layer</w:t>
+            </w:r>
+          </w:p>
+        </w:tc>
+        <w:tc>
+          <w:tcPr>
+            <w:tcW w:type="auto" w:w="100"/>
+            <w:shd w:fill="1a1a2e" w:color="1a1a2e" w:val="solid"/>
+          </w:tcPr>
+          <w:p>
+            <w:r>
+              <w:rPr>
+                <w:rFonts w:ascii="Calibri" w:cs="Calibri" w:eastAsia="Calibri" w:hAnsi="Calibri"/>
+                <w:b/>
+                <w:bCs/>
+                <w:color w:val="ffffff"/>
+                <w:sz w:val="20"/>
+                <w:szCs w:val="20"/>
+              </w:rPr>
+              <w:t xml:space="preserve">What It Does</w:t>
+            </w:r>
+          </w:p>
+        </w:tc>
+        <w:tc>
+          <w:tcPr>
+            <w:tcW w:type="auto" w:w="100"/>
+            <w:shd w:fill="1a1a2e" w:color="1a1a2e" w:val="solid"/>
+          </w:tcPr>
+          <w:p>
+            <w:r>
+              <w:rPr>
+                <w:rFonts w:ascii="Calibri" w:cs="Calibri" w:eastAsia="Calibri" w:hAnsi="Calibri"/>
+                <w:b/>
+                <w:bCs/>
+                <w:color w:val="ffffff"/>
+                <w:sz w:val="20"/>
+                <w:szCs w:val="20"/>
+              </w:rPr>
+              <w:t xml:space="preserve">Where It Runs</w:t>
+            </w:r>
+          </w:p>
+        </w:tc>
+        <w:tc>
+          <w:tcPr>
+            <w:tcW w:type="auto" w:w="100"/>
+            <w:shd w:fill="1a1a2e" w:color="1a1a2e" w:val="solid"/>
+          </w:tcPr>
+          <w:p>
+            <w:r>
+              <w:rPr>
+                <w:rFonts w:ascii="Calibri" w:cs="Calibri" w:eastAsia="Calibri" w:hAnsi="Calibri"/>
+                <w:b/>
+                <w:bCs/>
+                <w:color w:val="ffffff"/>
+                <w:sz w:val="20"/>
+                <w:szCs w:val="20"/>
+              </w:rPr>
+              <w:t xml:space="preserve">Tragar Effort</w:t>
+            </w:r>
+          </w:p>
+        </w:tc>
+      </w:tr>
+      <w:tr>
+        <w:tc>
+          <w:tcPr>
+            <w:tcW w:type="auto" w:w="100"/>
+          </w:tcPr>
+          <w:p>
+            <w:r>
+              <w:rPr>
+                <w:rFonts w:ascii="Calibri" w:cs="Calibri" w:eastAsia="Calibri" w:hAnsi="Calibri"/>
+                <w:b w:val="false"/>
+                <w:bCs w:val="false"/>
+                <w:color w:val="333333"/>
+                <w:sz w:val="20"/>
+                <w:szCs w:val="20"/>
+              </w:rPr>
+              <w:t xml:space="preserve">1. Data Collection</w:t>
+            </w:r>
+          </w:p>
+        </w:tc>
+        <w:tc>
+          <w:tcPr>
+            <w:tcW w:type="auto" w:w="100"/>
+          </w:tcPr>
+          <w:p>
+            <w:r>
+              <w:rPr>
+                <w:rFonts w:ascii="Calibri" w:cs="Calibri" w:eastAsia="Calibri" w:hAnsi="Calibri"/>
+                <w:b w:val="false"/>
+                <w:bCs w:val="false"/>
+                <w:color w:val="333333"/>
+                <w:sz w:val="20"/>
+                <w:szCs w:val="20"/>
+              </w:rPr>
+              <w:t xml:space="preserve">Gathers GPS, speed, phone status, vehicle telemetry</w:t>
+            </w:r>
+          </w:p>
+        </w:tc>
+        <w:tc>
+          <w:tcPr>
+            <w:tcW w:type="auto" w:w="100"/>
+          </w:tcPr>
+          <w:p>
+            <w:r>
+              <w:rPr>
+                <w:rFonts w:ascii="Calibri" w:cs="Calibri" w:eastAsia="Calibri" w:hAnsi="Calibri"/>
+                <w:b w:val="false"/>
+                <w:bCs w:val="false"/>
+                <w:color w:val="333333"/>
+                <w:sz w:val="20"/>
+                <w:szCs w:val="20"/>
+              </w:rPr>
+              <w:t xml:space="preserve">Tracking API / Driver phone / OBD device</w:t>
+            </w:r>
+          </w:p>
+        </w:tc>
+        <w:tc>
+          <w:tcPr>
+            <w:tcW w:type="auto" w:w="100"/>
+          </w:tcPr>
+          <w:p>
+            <w:r>
+              <w:rPr>
+                <w:rFonts w:ascii="Calibri" w:cs="Calibri" w:eastAsia="Calibri" w:hAnsi="Calibri"/>
+                <w:b w:val="false"/>
+                <w:bCs w:val="false"/>
+                <w:color w:val="333333"/>
+                <w:sz w:val="20"/>
+                <w:szCs w:val="20"/>
+              </w:rPr>
+              <w:t xml:space="preserve">Minimal — authorise API access or install app</w:t>
+            </w:r>
+          </w:p>
+        </w:tc>
+      </w:tr>
+      <w:tr>
+        <w:tc>
+          <w:tcPr>
+            <w:tcW w:type="auto" w:w="100"/>
+          </w:tcPr>
+          <w:p>
+            <w:r>
+              <w:rPr>
+                <w:rFonts w:ascii="Calibri" w:cs="Calibri" w:eastAsia="Calibri" w:hAnsi="Calibri"/>
+                <w:b w:val="false"/>
+                <w:bCs w:val="false"/>
+                <w:color w:val="333333"/>
+                <w:sz w:val="20"/>
+                <w:szCs w:val="20"/>
+              </w:rPr>
+              <w:t xml:space="preserve">2. AI Brain</w:t>
+            </w:r>
+          </w:p>
+        </w:tc>
+        <w:tc>
+          <w:tcPr>
+            <w:tcW w:type="auto" w:w="100"/>
+          </w:tcPr>
+          <w:p>
+            <w:r>
+              <w:rPr>
+                <w:rFonts w:ascii="Calibri" w:cs="Calibri" w:eastAsia="Calibri" w:hAnsi="Calibri"/>
+                <w:b w:val="false"/>
+                <w:bCs w:val="false"/>
+                <w:color w:val="333333"/>
+                <w:sz w:val="20"/>
+                <w:szCs w:val="20"/>
+              </w:rPr>
+              <w:t xml:space="preserve">Learns behaviour, detects anomalies, scores threats</w:t>
+            </w:r>
+          </w:p>
+        </w:tc>
+        <w:tc>
+          <w:tcPr>
+            <w:tcW w:type="auto" w:w="100"/>
+          </w:tcPr>
+          <w:p>
+            <w:r>
+              <w:rPr>
+                <w:rFonts w:ascii="Calibri" w:cs="Calibri" w:eastAsia="Calibri" w:hAnsi="Calibri"/>
+                <w:b w:val="false"/>
+                <w:bCs w:val="false"/>
+                <w:color w:val="333333"/>
+                <w:sz w:val="20"/>
+                <w:szCs w:val="20"/>
+              </w:rPr>
+              <w:t xml:space="preserve">Secure cloud servers</w:t>
+            </w:r>
+          </w:p>
+        </w:tc>
+        <w:tc>
+          <w:tcPr>
+            <w:tcW w:type="auto" w:w="100"/>
+          </w:tcPr>
+          <w:p>
+            <w:r>
+              <w:rPr>
+                <w:rFonts w:ascii="Calibri" w:cs="Calibri" w:eastAsia="Calibri" w:hAnsi="Calibri"/>
+                <w:b w:val="false"/>
+                <w:bCs w:val="false"/>
+                <w:color w:val="333333"/>
+                <w:sz w:val="20"/>
+                <w:szCs w:val="20"/>
+              </w:rPr>
+              <w:t xml:space="preserve">None — fully managed by us</w:t>
+            </w:r>
+          </w:p>
+        </w:tc>
+      </w:tr>
+      <w:tr>
+        <w:tc>
+          <w:tcPr>
+            <w:tcW w:type="auto" w:w="100"/>
+          </w:tcPr>
+          <w:p>
+            <w:r>
+              <w:rPr>
+                <w:rFonts w:ascii="Calibri" w:cs="Calibri" w:eastAsia="Calibri" w:hAnsi="Calibri"/>
+                <w:b w:val="false"/>
+                <w:bCs w:val="false"/>
+                <w:color w:val="333333"/>
+                <w:sz w:val="20"/>
+                <w:szCs w:val="20"/>
+              </w:rPr>
+              <w:t xml:space="preserve">3. Alerts</w:t>
+            </w:r>
+          </w:p>
+        </w:tc>
+        <w:tc>
+          <w:tcPr>
+            <w:tcW w:type="auto" w:w="100"/>
+          </w:tcPr>
+          <w:p>
+            <w:r>
+              <w:rPr>
+                <w:rFonts w:ascii="Calibri" w:cs="Calibri" w:eastAsia="Calibri" w:hAnsi="Calibri"/>
+                <w:b w:val="false"/>
+                <w:bCs w:val="false"/>
+                <w:color w:val="333333"/>
+                <w:sz w:val="20"/>
+                <w:szCs w:val="20"/>
+              </w:rPr>
+              <w:t xml:space="preserve">Notifies control room, managers, emergency contacts</w:t>
+            </w:r>
+          </w:p>
+        </w:tc>
+        <w:tc>
+          <w:tcPr>
+            <w:tcW w:type="auto" w:w="100"/>
+          </w:tcPr>
+          <w:p>
+            <w:r>
+              <w:rPr>
+                <w:rFonts w:ascii="Calibri" w:cs="Calibri" w:eastAsia="Calibri" w:hAnsi="Calibri"/>
+                <w:b w:val="false"/>
+                <w:bCs w:val="false"/>
+                <w:color w:val="333333"/>
+                <w:sz w:val="20"/>
+                <w:szCs w:val="20"/>
+              </w:rPr>
+              <w:t xml:space="preserve">Dashboard + mobile + SMS/WhatsApp</w:t>
+            </w:r>
+          </w:p>
+        </w:tc>
+        <w:tc>
+          <w:tcPr>
+            <w:tcW w:type="auto" w:w="100"/>
+          </w:tcPr>
+          <w:p>
+            <w:r>
+              <w:rPr>
+                <w:rFonts w:ascii="Calibri" w:cs="Calibri" w:eastAsia="Calibri" w:hAnsi="Calibri"/>
+                <w:b w:val="false"/>
+                <w:bCs w:val="false"/>
+                <w:color w:val="333333"/>
+                <w:sz w:val="20"/>
+                <w:szCs w:val="20"/>
+              </w:rPr>
+              <w:t xml:space="preserve">Designate who receives alerts</w:t>
+            </w:r>
+          </w:p>
+        </w:tc>
+      </w:tr>
+      <w:tr>
+        <w:tc>
+          <w:tcPr>
+            <w:tcW w:type="auto" w:w="100"/>
+          </w:tcPr>
+          <w:p>
+            <w:r>
+              <w:rPr>
+                <w:rFonts w:ascii="Calibri" w:cs="Calibri" w:eastAsia="Calibri" w:hAnsi="Calibri"/>
+                <w:b w:val="false"/>
+                <w:bCs w:val="false"/>
+                <w:color w:val="333333"/>
+                <w:sz w:val="20"/>
+                <w:szCs w:val="20"/>
+              </w:rPr>
+              <w:t xml:space="preserve">4. Forensic Evidence</w:t>
+            </w:r>
+          </w:p>
+        </w:tc>
+        <w:tc>
+          <w:tcPr>
+            <w:tcW w:type="auto" w:w="100"/>
+          </w:tcPr>
+          <w:p>
+            <w:r>
+              <w:rPr>
+                <w:rFonts w:ascii="Calibri" w:cs="Calibri" w:eastAsia="Calibri" w:hAnsi="Calibri"/>
+                <w:b w:val="false"/>
+                <w:bCs w:val="false"/>
+                <w:color w:val="333333"/>
+                <w:sz w:val="20"/>
+                <w:szCs w:val="20"/>
+              </w:rPr>
+              <w:t xml:space="preserve">Captures and secures incident data for claims/police</w:t>
+            </w:r>
+          </w:p>
+        </w:tc>
+        <w:tc>
+          <w:tcPr>
+            <w:tcW w:type="auto" w:w="100"/>
+          </w:tcPr>
+          <w:p>
+            <w:r>
+              <w:rPr>
+                <w:rFonts w:ascii="Calibri" w:cs="Calibri" w:eastAsia="Calibri" w:hAnsi="Calibri"/>
+                <w:b w:val="false"/>
+                <w:bCs w:val="false"/>
+                <w:color w:val="333333"/>
+                <w:sz w:val="20"/>
+                <w:szCs w:val="20"/>
+              </w:rPr>
+              <w:t xml:space="preserve">Secure cloud storage</w:t>
+            </w:r>
+          </w:p>
+        </w:tc>
+        <w:tc>
+          <w:tcPr>
+            <w:tcW w:type="auto" w:w="100"/>
+          </w:tcPr>
+          <w:p>
+            <w:r>
+              <w:rPr>
+                <w:rFonts w:ascii="Calibri" w:cs="Calibri" w:eastAsia="Calibri" w:hAnsi="Calibri"/>
+                <w:b w:val="false"/>
+                <w:bCs w:val="false"/>
+                <w:color w:val="333333"/>
+                <w:sz w:val="20"/>
+                <w:szCs w:val="20"/>
+              </w:rPr>
+              <w:t xml:space="preserve">None — automatic</w:t>
+            </w:r>
+          </w:p>
+        </w:tc>
+      </w:tr>
+      <w:tr>
+        <w:tc>
+          <w:tcPr>
+            <w:tcW w:type="auto" w:w="100"/>
+          </w:tcPr>
+          <w:p>
+            <w:r>
+              <w:rPr>
+                <w:rFonts w:ascii="Calibri" w:cs="Calibri" w:eastAsia="Calibri" w:hAnsi="Calibri"/>
+                <w:b w:val="false"/>
+                <w:bCs w:val="false"/>
+                <w:color w:val="333333"/>
+                <w:sz w:val="20"/>
+                <w:szCs w:val="20"/>
+              </w:rPr>
+              <w:t xml:space="preserve">5. Predictive Intel</w:t>
+            </w:r>
+          </w:p>
+        </w:tc>
+        <w:tc>
+          <w:tcPr>
+            <w:tcW w:type="auto" w:w="100"/>
+          </w:tcPr>
+          <w:p>
+            <w:r>
+              <w:rPr>
+                <w:rFonts w:ascii="Calibri" w:cs="Calibri" w:eastAsia="Calibri" w:hAnsi="Calibri"/>
+                <w:b w:val="false"/>
+                <w:bCs w:val="false"/>
+                <w:color w:val="333333"/>
+                <w:sz w:val="20"/>
+                <w:szCs w:val="20"/>
+              </w:rPr>
+              <w:t xml:space="preserve">Maps risk, recommends routes, community intelligence</w:t>
+            </w:r>
+          </w:p>
+        </w:tc>
+        <w:tc>
+          <w:tcPr>
+            <w:tcW w:type="auto" w:w="100"/>
+          </w:tcPr>
+          <w:p>
+            <w:r>
+              <w:rPr>
+                <w:rFonts w:ascii="Calibri" w:cs="Calibri" w:eastAsia="Calibri" w:hAnsi="Calibri"/>
+                <w:b w:val="false"/>
+                <w:bCs w:val="false"/>
+                <w:color w:val="333333"/>
+                <w:sz w:val="20"/>
+                <w:szCs w:val="20"/>
+              </w:rPr>
+              <w:t xml:space="preserve">Dashboard + dispatch integration</w:t>
+            </w:r>
+          </w:p>
+        </w:tc>
+        <w:tc>
+          <w:tcPr>
+            <w:tcW w:type="auto" w:w="100"/>
+          </w:tcPr>
+          <w:p>
+            <w:r>
+              <w:rPr>
+                <w:rFonts w:ascii="Calibri" w:cs="Calibri" w:eastAsia="Calibri" w:hAnsi="Calibri"/>
+                <w:b w:val="false"/>
+                <w:bCs w:val="false"/>
+                <w:color w:val="333333"/>
+                <w:sz w:val="20"/>
+                <w:szCs w:val="20"/>
+              </w:rPr>
+              <w:t xml:space="preserve">Optional — use insights for routing decisions</w:t>
+            </w:r>
+          </w:p>
+        </w:tc>
+      </w:tr>
+    </w:tbl>
+    <w:p>
+      <w:pPr>
+        <w:pBdr>
+          <w:bottom w:val="single" w:color="cccccc" w:sz="1"/>
+        </w:pBdr>
+        <w:spacing w:after="200" w:before="200"/>
+      </w:pPr>
+      <w:r>
+        <w:t xml:space="preserve"/>
+      </w:r>
+    </w:p>
+    <w:p>
+      <w:pPr>
+        <w:pStyle w:val="Heading2"/>
+        <w:spacing w:after="200" w:before="400"/>
+      </w:pPr>
+      <w:r>
+        <w:rPr>
+          <w:rFonts w:ascii="Calibri" w:cs="Calibri" w:eastAsia="Calibri" w:hAnsi="Calibri"/>
+          <w:b/>
+          <w:bCs/>
+          <w:color w:val="1a1a2e"/>
+        </w:rPr>
+        <w:t xml:space="preserve">What Tragar Actually Needs to Do</w:t>
+      </w:r>
+    </w:p>
+    <w:p>
+      <w:pPr>
+        <w:spacing w:after="120"/>
+      </w:pPr>
+      <w:r>
+        <w:rPr>
+          <w:rFonts w:ascii="Calibri" w:cs="Calibri" w:eastAsia="Calibri" w:hAnsi="Calibri"/>
+          <w:color w:val="333333"/>
+          <w:sz w:val="22"/>
+          <w:szCs w:val="22"/>
+        </w:rPr>
+        <w:t xml:space="preserve">The implementation effort from Tragar's side is minimal. Here is the complete list:</w:t>
+      </w:r>
+    </w:p>
+    <w:p>
+      <w:pPr>
+        <w:spacing w:after="100"/>
+      </w:pPr>
+      <w:r>
+        <w:rPr>
+          <w:rFonts w:ascii="Calibri" w:cs="Calibri" w:eastAsia="Calibri" w:hAnsi="Calibri"/>
+          <w:b/>
+          <w:bCs/>
+          <w:color w:val="1a1a2e"/>
+          <w:sz w:val="22"/>
+          <w:szCs w:val="22"/>
+        </w:rPr>
+        <w:t xml:space="preserve">1. </w:t>
+      </w:r>
+      <w:r>
+        <w:rPr>
+          <w:rFonts w:ascii="Calibri" w:cs="Calibri" w:eastAsia="Calibri" w:hAnsi="Calibri"/>
+          <w:color w:val="333333"/>
+          <w:sz w:val="22"/>
+          <w:szCs w:val="22"/>
+        </w:rPr>
+        <w:t xml:space="preserve">Provide the name of your current tracking provider and authorise API access (I handle the technical connection)</w:t>
+      </w:r>
+    </w:p>
+    <w:p>
+      <w:pPr>
+        <w:spacing w:after="100"/>
+      </w:pPr>
+      <w:r>
+        <w:rPr>
+          <w:rFonts w:ascii="Calibri" w:cs="Calibri" w:eastAsia="Calibri" w:hAnsi="Calibri"/>
+          <w:b/>
+          <w:bCs/>
+          <w:color w:val="1a1a2e"/>
+          <w:sz w:val="22"/>
+          <w:szCs w:val="22"/>
+        </w:rPr>
+        <w:t xml:space="preserve">2. </w:t>
+      </w:r>
+      <w:r>
+        <w:rPr>
+          <w:rFonts w:ascii="Calibri" w:cs="Calibri" w:eastAsia="Calibri" w:hAnsi="Calibri"/>
+          <w:color w:val="333333"/>
+          <w:sz w:val="22"/>
+          <w:szCs w:val="22"/>
+        </w:rPr>
+        <w:t xml:space="preserve">Identify 10–20 pilot vehicles and their primary drivers</w:t>
+      </w:r>
+    </w:p>
+    <w:p>
+      <w:pPr>
+        <w:spacing w:after="100"/>
+      </w:pPr>
+      <w:r>
+        <w:rPr>
+          <w:rFonts w:ascii="Calibri" w:cs="Calibri" w:eastAsia="Calibri" w:hAnsi="Calibri"/>
+          <w:b/>
+          <w:bCs/>
+          <w:color w:val="1a1a2e"/>
+          <w:sz w:val="22"/>
+          <w:szCs w:val="22"/>
+        </w:rPr>
+        <w:t xml:space="preserve">3. </w:t>
+      </w:r>
+      <w:r>
+        <w:rPr>
+          <w:rFonts w:ascii="Calibri" w:cs="Calibri" w:eastAsia="Calibri" w:hAnsi="Calibri"/>
+          <w:color w:val="333333"/>
+          <w:sz w:val="22"/>
+          <w:szCs w:val="22"/>
+        </w:rPr>
+        <w:t xml:space="preserve">Share basic route/delivery schedule data for those vehicles (even a spreadsheet is fine)</w:t>
+      </w:r>
+    </w:p>
+    <w:p>
+      <w:pPr>
+        <w:spacing w:after="100"/>
+      </w:pPr>
+      <w:r>
+        <w:rPr>
+          <w:rFonts w:ascii="Calibri" w:cs="Calibri" w:eastAsia="Calibri" w:hAnsi="Calibri"/>
+          <w:b/>
+          <w:bCs/>
+          <w:color w:val="1a1a2e"/>
+          <w:sz w:val="22"/>
+          <w:szCs w:val="22"/>
+        </w:rPr>
+        <w:t xml:space="preserve">4. </w:t>
+      </w:r>
+      <w:r>
+        <w:rPr>
+          <w:rFonts w:ascii="Calibri" w:cs="Calibri" w:eastAsia="Calibri" w:hAnsi="Calibri"/>
+          <w:color w:val="333333"/>
+          <w:sz w:val="22"/>
+          <w:szCs w:val="22"/>
+        </w:rPr>
+        <w:t xml:space="preserve">If using the smartphone app: ask pilot drivers to install the app (5 minutes per driver)</w:t>
+      </w:r>
+    </w:p>
+    <w:p>
+      <w:pPr>
+        <w:spacing w:after="100"/>
+      </w:pPr>
+      <w:r>
+        <w:rPr>
+          <w:rFonts w:ascii="Calibri" w:cs="Calibri" w:eastAsia="Calibri" w:hAnsi="Calibri"/>
+          <w:b/>
+          <w:bCs/>
+          <w:color w:val="1a1a2e"/>
+          <w:sz w:val="22"/>
+          <w:szCs w:val="22"/>
+        </w:rPr>
+        <w:t xml:space="preserve">5. </w:t>
+      </w:r>
+      <w:r>
+        <w:rPr>
+          <w:rFonts w:ascii="Calibri" w:cs="Calibri" w:eastAsia="Calibri" w:hAnsi="Calibri"/>
+          <w:color w:val="333333"/>
+          <w:sz w:val="22"/>
+          <w:szCs w:val="22"/>
+        </w:rPr>
+        <w:t xml:space="preserve">If using OBD devices: allow installation in 3–5 vehicles (15 minutes per vehicle, I do the install)</w:t>
+      </w:r>
+    </w:p>
+    <w:p>
+      <w:pPr>
+        <w:spacing w:after="100"/>
+      </w:pPr>
+      <w:r>
+        <w:rPr>
+          <w:rFonts w:ascii="Calibri" w:cs="Calibri" w:eastAsia="Calibri" w:hAnsi="Calibri"/>
+          <w:b/>
+          <w:bCs/>
+          <w:color w:val="1a1a2e"/>
+          <w:sz w:val="22"/>
+          <w:szCs w:val="22"/>
+        </w:rPr>
+        <w:t xml:space="preserve">6. </w:t>
+      </w:r>
+      <w:r>
+        <w:rPr>
+          <w:rFonts w:ascii="Calibri" w:cs="Calibri" w:eastAsia="Calibri" w:hAnsi="Calibri"/>
+          <w:color w:val="333333"/>
+          <w:sz w:val="22"/>
+          <w:szCs w:val="22"/>
+        </w:rPr>
+        <w:t xml:space="preserve">Designate 2–3 people to receive alerts and access the dashboard</w:t>
+      </w:r>
+    </w:p>
+    <w:p>
+      <w:pPr>
+        <w:spacing w:after="100"/>
+      </w:pPr>
+      <w:r>
+        <w:rPr>
+          <w:rFonts w:ascii="Calibri" w:cs="Calibri" w:eastAsia="Calibri" w:hAnsi="Calibri"/>
+          <w:b/>
+          <w:bCs/>
+          <w:color w:val="1a1a2e"/>
+          <w:sz w:val="22"/>
+          <w:szCs w:val="22"/>
+        </w:rPr>
+        <w:t xml:space="preserve">7. </w:t>
+      </w:r>
+      <w:r>
+        <w:rPr>
+          <w:rFonts w:ascii="Calibri" w:cs="Calibri" w:eastAsia="Calibri" w:hAnsi="Calibri"/>
+          <w:color w:val="333333"/>
+          <w:sz w:val="22"/>
+          <w:szCs w:val="22"/>
+        </w:rPr>
+        <w:t xml:space="preserve">Give feedback during weekly check-ins (15–20 minutes per week)</w:t>
+      </w:r>
+    </w:p>
+    <w:p>
+      <w:pPr>
+        <w:spacing w:after="120"/>
+      </w:pPr>
+      <w:r>
+        <w:rPr>
+          <w:rFonts w:ascii="Calibri" w:cs="Calibri" w:eastAsia="Calibri" w:hAnsi="Calibri"/>
+          <w:color w:val="333333"/>
+          <w:sz w:val="22"/>
+          <w:szCs w:val="22"/>
+        </w:rPr>
+        <w:t xml:space="preserve">That's it. Everything else — setup, configuration, AI training, monitoring, reporting — I handle entirely.</w:t>
+      </w:r>
+    </w:p>
+    <w:p>
+      <w:pPr>
+        <w:pBdr>
+          <w:bottom w:val="single" w:color="cccccc" w:sz="1"/>
+        </w:pBdr>
+        <w:spacing w:after="200" w:before="200"/>
+      </w:pPr>
+      <w:r>
+        <w:t xml:space="preserve"/>
+      </w:r>
+    </w:p>
+    <w:p>
+      <w:pPr>
+        <w:pStyle w:val="Heading2"/>
+        <w:spacing w:after="200" w:before="400"/>
+      </w:pPr>
+      <w:r>
+        <w:rPr>
+          <w:rFonts w:ascii="Calibri" w:cs="Calibri" w:eastAsia="Calibri" w:hAnsi="Calibri"/>
+          <w:b/>
+          <w:bCs/>
+          <w:color w:val="1a1a2e"/>
+        </w:rPr>
+        <w:t xml:space="preserve">Cost to Tragar During the Pilot</w:t>
+      </w:r>
+    </w:p>
+    <w:tbl>
+      <w:tblPr>
+        <w:tblW w:type="pct" w:w="100%"/>
+        <w:tblBorders>
+          <w:top w:val="single" w:color="auto" w:sz="4"/>
+          <w:left w:val="single" w:color="auto" w:sz="4"/>
+          <w:bottom w:val="single" w:color="auto" w:sz="4"/>
+          <w:right w:val="single" w:color="auto" w:sz="4"/>
+          <w:insideH w:val="single" w:color="auto" w:sz="4"/>
+          <w:insideV w:val="single" w:color="auto" w:sz="4"/>
+        </w:tblBorders>
+      </w:tblPr>
+      <w:tblGrid>
+        <w:gridCol w:w="100"/>
+        <w:gridCol w:w="100"/>
+      </w:tblGrid>
+      <w:tr>
+        <w:tc>
+          <w:tcPr>
+            <w:tcW w:type="auto" w:w="100"/>
+            <w:shd w:fill="1a1a2e" w:color="1a1a2e" w:val="solid"/>
+          </w:tcPr>
+          <w:p>
+            <w:r>
+              <w:rPr>
+                <w:rFonts w:ascii="Calibri" w:cs="Calibri" w:eastAsia="Calibri" w:hAnsi="Calibri"/>
+                <w:b/>
+                <w:bCs/>
+                <w:color w:val="ffffff"/>
+                <w:sz w:val="20"/>
+                <w:szCs w:val="20"/>
+              </w:rPr>
+              <w:t xml:space="preserve">Item</w:t>
+            </w:r>
+          </w:p>
+        </w:tc>
+        <w:tc>
+          <w:tcPr>
+            <w:tcW w:type="auto" w:w="100"/>
+            <w:shd w:fill="1a1a2e" w:color="1a1a2e" w:val="solid"/>
+          </w:tcPr>
+          <w:p>
+            <w:r>
+              <w:rPr>
+                <w:rFonts w:ascii="Calibri" w:cs="Calibri" w:eastAsia="Calibri" w:hAnsi="Calibri"/>
+                <w:b/>
+                <w:bCs/>
+                <w:color w:val="ffffff"/>
+                <w:sz w:val="20"/>
+                <w:szCs w:val="20"/>
+              </w:rPr>
+              <w:t xml:space="preserve">Cost to Tragar</w:t>
+            </w:r>
+          </w:p>
+        </w:tc>
+      </w:tr>
+      <w:tr>
+        <w:tc>
+          <w:tcPr>
+            <w:tcW w:type="auto" w:w="100"/>
+          </w:tcPr>
+          <w:p>
+            <w:r>
+              <w:rPr>
+                <w:rFonts w:ascii="Calibri" w:cs="Calibri" w:eastAsia="Calibri" w:hAnsi="Calibri"/>
+                <w:b w:val="false"/>
+                <w:bCs w:val="false"/>
+                <w:color w:val="333333"/>
+                <w:sz w:val="20"/>
+                <w:szCs w:val="20"/>
+              </w:rPr>
+              <w:t xml:space="preserve">AI AntiHijack software and cloud processing</w:t>
+            </w:r>
+          </w:p>
+        </w:tc>
+        <w:tc>
+          <w:tcPr>
+            <w:tcW w:type="auto" w:w="100"/>
+          </w:tcPr>
+          <w:p>
+            <w:r>
+              <w:rPr>
+                <w:rFonts w:ascii="Calibri" w:cs="Calibri" w:eastAsia="Calibri" w:hAnsi="Calibri"/>
+                <w:b w:val="false"/>
+                <w:bCs w:val="false"/>
+                <w:color w:val="333333"/>
+                <w:sz w:val="20"/>
+                <w:szCs w:val="20"/>
+              </w:rPr>
+              <w:t xml:space="preserve">R0 — free for the full 90-day pilot</w:t>
+            </w:r>
+          </w:p>
+        </w:tc>
+      </w:tr>
+      <w:tr>
+        <w:tc>
+          <w:tcPr>
+            <w:tcW w:type="auto" w:w="100"/>
+          </w:tcPr>
+          <w:p>
+            <w:r>
+              <w:rPr>
+                <w:rFonts w:ascii="Calibri" w:cs="Calibri" w:eastAsia="Calibri" w:hAnsi="Calibri"/>
+                <w:b w:val="false"/>
+                <w:bCs w:val="false"/>
+                <w:color w:val="333333"/>
+                <w:sz w:val="20"/>
+                <w:szCs w:val="20"/>
+              </w:rPr>
+              <w:t xml:space="preserve">Dashboard and alert system access</w:t>
+            </w:r>
+          </w:p>
+        </w:tc>
+        <w:tc>
+          <w:tcPr>
+            <w:tcW w:type="auto" w:w="100"/>
+          </w:tcPr>
+          <w:p>
+            <w:r>
+              <w:rPr>
+                <w:rFonts w:ascii="Calibri" w:cs="Calibri" w:eastAsia="Calibri" w:hAnsi="Calibri"/>
+                <w:b w:val="false"/>
+                <w:bCs w:val="false"/>
+                <w:color w:val="333333"/>
+                <w:sz w:val="20"/>
+                <w:szCs w:val="20"/>
+              </w:rPr>
+              <w:t xml:space="preserve">R0 — free for the full 90-day pilot</w:t>
+            </w:r>
+          </w:p>
+        </w:tc>
+      </w:tr>
+      <w:tr>
+        <w:tc>
+          <w:tcPr>
+            <w:tcW w:type="auto" w:w="100"/>
+          </w:tcPr>
+          <w:p>
+            <w:r>
+              <w:rPr>
+                <w:rFonts w:ascii="Calibri" w:cs="Calibri" w:eastAsia="Calibri" w:hAnsi="Calibri"/>
+                <w:b w:val="false"/>
+                <w:bCs w:val="false"/>
+                <w:color w:val="333333"/>
+                <w:sz w:val="20"/>
+                <w:szCs w:val="20"/>
+              </w:rPr>
+              <w:t xml:space="preserve">Driver smartphone app</w:t>
+            </w:r>
+          </w:p>
+        </w:tc>
+        <w:tc>
+          <w:tcPr>
+            <w:tcW w:type="auto" w:w="100"/>
+          </w:tcPr>
+          <w:p>
+            <w:r>
+              <w:rPr>
+                <w:rFonts w:ascii="Calibri" w:cs="Calibri" w:eastAsia="Calibri" w:hAnsi="Calibri"/>
+                <w:b w:val="false"/>
+                <w:bCs w:val="false"/>
+                <w:color w:val="333333"/>
+                <w:sz w:val="20"/>
+                <w:szCs w:val="20"/>
+              </w:rPr>
+              <w:t xml:space="preserve">R0 — free download, minimal data usage (&lt; 50MB/month)</w:t>
+            </w:r>
+          </w:p>
+        </w:tc>
+      </w:tr>
+      <w:tr>
+        <w:tc>
+          <w:tcPr>
+            <w:tcW w:type="auto" w:w="100"/>
+          </w:tcPr>
+          <w:p>
+            <w:r>
+              <w:rPr>
+                <w:rFonts w:ascii="Calibri" w:cs="Calibri" w:eastAsia="Calibri" w:hAnsi="Calibri"/>
+                <w:b w:val="false"/>
+                <w:bCs w:val="false"/>
+                <w:color w:val="333333"/>
+                <w:sz w:val="20"/>
+                <w:szCs w:val="20"/>
+              </w:rPr>
+              <w:t xml:space="preserve">OBD-II devices (if used on 3–5 vehicles)</w:t>
+            </w:r>
+          </w:p>
+        </w:tc>
+        <w:tc>
+          <w:tcPr>
+            <w:tcW w:type="auto" w:w="100"/>
+          </w:tcPr>
+          <w:p>
+            <w:r>
+              <w:rPr>
+                <w:rFonts w:ascii="Calibri" w:cs="Calibri" w:eastAsia="Calibri" w:hAnsi="Calibri"/>
+                <w:b w:val="false"/>
+                <w:bCs w:val="false"/>
+                <w:color w:val="333333"/>
+                <w:sz w:val="20"/>
+                <w:szCs w:val="20"/>
+              </w:rPr>
+              <w:t xml:space="preserve">R0 — I cover the device cost for the pilot</w:t>
+            </w:r>
+          </w:p>
+        </w:tc>
+      </w:tr>
+      <w:tr>
+        <w:tc>
+          <w:tcPr>
+            <w:tcW w:type="auto" w:w="100"/>
+          </w:tcPr>
+          <w:p>
+            <w:r>
+              <w:rPr>
+                <w:rFonts w:ascii="Calibri" w:cs="Calibri" w:eastAsia="Calibri" w:hAnsi="Calibri"/>
+                <w:b w:val="false"/>
+                <w:bCs w:val="false"/>
+                <w:color w:val="333333"/>
+                <w:sz w:val="20"/>
+                <w:szCs w:val="20"/>
+              </w:rPr>
+              <w:t xml:space="preserve">Setup, configuration, and training</w:t>
+            </w:r>
+          </w:p>
+        </w:tc>
+        <w:tc>
+          <w:tcPr>
+            <w:tcW w:type="auto" w:w="100"/>
+          </w:tcPr>
+          <w:p>
+            <w:r>
+              <w:rPr>
+                <w:rFonts w:ascii="Calibri" w:cs="Calibri" w:eastAsia="Calibri" w:hAnsi="Calibri"/>
+                <w:b w:val="false"/>
+                <w:bCs w:val="false"/>
+                <w:color w:val="333333"/>
+                <w:sz w:val="20"/>
+                <w:szCs w:val="20"/>
+              </w:rPr>
+              <w:t xml:space="preserve">R0 — I do all setup at no charge</w:t>
+            </w:r>
+          </w:p>
+        </w:tc>
+      </w:tr>
+      <w:tr>
+        <w:tc>
+          <w:tcPr>
+            <w:tcW w:type="auto" w:w="100"/>
+          </w:tcPr>
+          <w:p>
+            <w:r>
+              <w:rPr>
+                <w:rFonts w:ascii="Calibri" w:cs="Calibri" w:eastAsia="Calibri" w:hAnsi="Calibri"/>
+                <w:b w:val="false"/>
+                <w:bCs w:val="false"/>
+                <w:color w:val="333333"/>
+                <w:sz w:val="20"/>
+                <w:szCs w:val="20"/>
+              </w:rPr>
+              <w:t xml:space="preserve">Weekly reporting and check-ins</w:t>
+            </w:r>
+          </w:p>
+        </w:tc>
+        <w:tc>
+          <w:tcPr>
+            <w:tcW w:type="auto" w:w="100"/>
+          </w:tcPr>
+          <w:p>
+            <w:r>
+              <w:rPr>
+                <w:rFonts w:ascii="Calibri" w:cs="Calibri" w:eastAsia="Calibri" w:hAnsi="Calibri"/>
+                <w:b w:val="false"/>
+                <w:bCs w:val="false"/>
+                <w:color w:val="333333"/>
+                <w:sz w:val="20"/>
+                <w:szCs w:val="20"/>
+              </w:rPr>
+              <w:t xml:space="preserve">R0 — included</w:t>
+            </w:r>
+          </w:p>
+        </w:tc>
+      </w:tr>
+      <w:tr>
+        <w:tc>
+          <w:tcPr>
+            <w:tcW w:type="auto" w:w="100"/>
+          </w:tcPr>
+          <w:p>
+            <w:r>
+              <w:rPr>
+                <w:rFonts w:ascii="Calibri" w:cs="Calibri" w:eastAsia="Calibri" w:hAnsi="Calibri"/>
+                <w:b w:val="false"/>
+                <w:bCs w:val="false"/>
+                <w:color w:val="333333"/>
+                <w:sz w:val="20"/>
+                <w:szCs w:val="20"/>
+              </w:rPr>
+              <w:t xml:space="preserve">TOTAL COST TO TRAGAR</w:t>
+            </w:r>
+          </w:p>
+        </w:tc>
+        <w:tc>
+          <w:tcPr>
+            <w:tcW w:type="auto" w:w="100"/>
+          </w:tcPr>
+          <w:p>
+            <w:r>
+              <w:rPr>
+                <w:rFonts w:ascii="Calibri" w:cs="Calibri" w:eastAsia="Calibri" w:hAnsi="Calibri"/>
+                <w:b w:val="false"/>
+                <w:bCs w:val="false"/>
+                <w:color w:val="333333"/>
+                <w:sz w:val="20"/>
+                <w:szCs w:val="20"/>
+              </w:rPr>
+              <w:t xml:space="preserve">R0 for 90 days</w:t>
+            </w:r>
+          </w:p>
+        </w:tc>
+      </w:tr>
+    </w:tbl>
+    <w:p>
+      <w:pPr>
+        <w:spacing w:after="120"/>
+      </w:pPr>
+      <w:r>
+        <w:rPr>
+          <w:rFonts w:ascii="Calibri" w:cs="Calibri" w:eastAsia="Calibri" w:hAnsi="Calibri"/>
+          <w:color w:val="333333"/>
+          <w:sz w:val="22"/>
+          <w:szCs w:val="22"/>
+        </w:rPr>
+        <w:t xml:space="preserve">After the pilot, if Tragar continues, pricing will be at founding partner rates — significantly below the standard market pricing I'll charge other logistics companies.</w:t>
+      </w:r>
+    </w:p>
+    <w:p>
+      <w:pPr>
+        <w:pBdr>
+          <w:bottom w:val="single" w:color="cccccc" w:sz="1"/>
+        </w:pBdr>
+        <w:spacing w:after="200" w:before="200"/>
+      </w:pPr>
+      <w:r>
+        <w:t xml:space="preserve"/>
+      </w:r>
+    </w:p>
+    <w:p>
+      <w:r>
+        <w:br w:type="page"/>
       </w:r>
     </w:p>
     <w:p>

</xml_diff>